<commit_message>
Corrigir geração de documento Word e melhorar formulário
- preparar-template.cjs: merge de runs XML divididos, 37 placeholders inseridos
- FormPassagens.jsx: dropdown de bancos c/ código COMPE automático, agência/conta com dígito separado, Meia Diária Deslocamento como Sim/Não
- gerarDocumento.js: passa todos os novos campos (linhas_poa, sei, componente, proc_numero, justificativa, agencia_digito, conta_digito, passagem, transporte, hospedagem)
- template-passagens.docx: novo template com todos os campos preenchíveis

Co-Authored-By: Claude Sonnet 4.6 <noreply@anthropic.com>
</commit_message>
<xml_diff>
--- a/public/template-passagens.docx
+++ b/public/template-passagens.docx
@@ -132,46 +132,7 @@
         <w:rPr>
           <w:rFonts w:ascii="Arial" w:hAnsi="Arial" w:cs="Arial"/>
         </w:rPr>
-        <w:t xml:space="preserve">É obrigatório o preenchimento de todas as informações do Beneficiário. </w:t>
-      </w:r>
-      <w:r>
-        <w:rPr>
-          <w:rFonts w:ascii="Arial" w:hAnsi="Arial" w:cs="Arial"/>
-          <w:color w:val="000000" w:themeColor="text1"/>
-        </w:rPr>
-        <w:t xml:space="preserve">A Unidade Executora do Projeto (FGV) não se responsabiliza por eventuais atrasos ou impossibilidade na emissão de passagens aéreas nacionais ou internacionais, indisponibilidade de voos, não realização de depósitos de diárias em data anterior ao evento ou ausência de vagas em meios de hospedagem, especialmente quando as solicitações forem efetuadas com </w:t>
-      </w:r>
-      <w:r>
-        <w:rPr>
-          <w:rFonts w:ascii="Arial" w:hAnsi="Arial" w:cs="Arial"/>
-          <w:b/>
-          <w:bCs/>
-          <w:color w:val="000000" w:themeColor="text1"/>
-        </w:rPr>
-        <w:t>prazo inferior a 20 (vinte) dias para demandas nacionais e 30 (trinta) dias para demandas internacionais</w:t>
-      </w:r>
-      <w:r>
-        <w:rPr>
-          <w:rFonts w:ascii="Arial" w:hAnsi="Arial" w:cs="Arial"/>
-          <w:color w:val="000000" w:themeColor="text1"/>
-        </w:rPr>
-        <w:t xml:space="preserve">, e/ou quando dependerem do </w:t>
-      </w:r>
-      <w:r>
-        <w:rPr>
-          <w:rFonts w:ascii="Arial" w:hAnsi="Arial" w:cs="Arial"/>
-          <w:b/>
-          <w:bCs/>
-          <w:color w:val="000000" w:themeColor="text1"/>
-        </w:rPr>
-        <w:t>fornecimento tempestivo de informações dos beneficiários</w:t>
-      </w:r>
-      <w:r>
-        <w:rPr>
-          <w:rFonts w:ascii="Arial" w:hAnsi="Arial" w:cs="Arial"/>
-          <w:color w:val="000000" w:themeColor="text1"/>
-        </w:rPr>
-        <w:t>, tais como dados cadastrais, autorizações e assinaturas.</w:t>
+        <w:t xml:space="preserve">É obrigatório o preenchimento de todas as informações do Beneficiário. A Unidade Executora do Projeto (FGV) não se responsabiliza por eventuais atrasos ou impossibilidade na emissão de passagens aéreas nacionais ou internacionais, indisponibilidade de voos, não realização de depósitos de diárias em data anterior ao evento ou ausência de vagas em meios de hospedagem, especialmente quando as solicitações forem efetuadas com prazo inferior a 20 (vinte) dias para demandas nacionais e 30 (trinta) dias para demandas internacionais, e/ou quando dependerem do fornecimento tempestivo de informações dos beneficiários, tais como dados cadastrais, autorizações e assinaturas.</w:t>
       </w:r>
     </w:p>
     <w:p>
@@ -200,18 +161,9 @@
           <w:sz w:val="26"/>
           <w:szCs w:val="26"/>
         </w:rPr>
-        <w:t xml:space="preserve">A(o) BENEFICIÁRIA(o) deverá preencher, somente os campos na cor cinza </w:t>
+        <w:t xml:space="preserve">A(o) BENEFICIÁRIA(o) deverá preencher, somente os campos na cor cinza [  ]</w:t>
       </w:r>
       <w:proofErr w:type="gramStart"/>
-      <w:r>
-        <w:rPr>
-          <w:rFonts w:ascii="Arial" w:hAnsi="Arial" w:cs="Arial"/>
-          <w:sz w:val="26"/>
-          <w:szCs w:val="26"/>
-          <w:highlight w:val="lightGray"/>
-        </w:rPr>
-        <w:t>[  ]</w:t>
-      </w:r>
       <w:proofErr w:type="gramEnd"/>
     </w:p>
     <w:p>
@@ -273,34 +225,7 @@
               <w:rPr>
                 <w:b/>
               </w:rPr>
-              <w:t>Unidade</w:t>
-            </w:r>
-            <w:r>
-              <w:rPr>
-                <w:b/>
-                <w:spacing w:val="-2"/>
-              </w:rPr>
-              <w:t xml:space="preserve"> </w:t>
-            </w:r>
-            <w:r>
-              <w:rPr>
-                <w:b/>
-              </w:rPr>
-              <w:t>de</w:t>
-            </w:r>
-            <w:r>
-              <w:rPr>
-                <w:b/>
-                <w:spacing w:val="-7"/>
-              </w:rPr>
-              <w:t xml:space="preserve"> </w:t>
-            </w:r>
-            <w:r>
-              <w:rPr>
-                <w:b/>
-                <w:spacing w:val="-2"/>
-              </w:rPr>
-              <w:t>Origem</w:t>
+              <w:t xml:space="preserve">Unidade de Origem</w:t>
             </w:r>
           </w:p>
         </w:tc>
@@ -356,27 +281,7 @@
               <w:rPr>
                 <w:b/>
               </w:rPr>
-              <w:t>Revisão</w:t>
-            </w:r>
-            <w:r>
-              <w:rPr>
-                <w:b/>
-                <w:spacing w:val="-5"/>
-              </w:rPr>
-              <w:t xml:space="preserve"> </w:t>
-            </w:r>
-            <w:r>
-              <w:rPr>
-                <w:b/>
-              </w:rPr>
-              <w:t>do</w:t>
-            </w:r>
-            <w:r>
-              <w:rPr>
-                <w:b/>
-                <w:spacing w:val="-2"/>
-              </w:rPr>
-              <w:t xml:space="preserve"> documento</w:t>
+              <w:t xml:space="preserve">Revisão do documento</w:t>
             </w:r>
           </w:p>
         </w:tc>
@@ -472,21 +377,7 @@
                 <w:bCs/>
                 <w:spacing w:val="-2"/>
               </w:rPr>
-              <w:t xml:space="preserve">Dez </w:t>
-            </w:r>
-            <w:r>
-              <w:rPr>
-                <w:bCs/>
-                <w:spacing w:val="-2"/>
-              </w:rPr>
-              <w:t>202</w:t>
-            </w:r>
-            <w:r>
-              <w:rPr>
-                <w:bCs/>
-                <w:spacing w:val="-2"/>
-              </w:rPr>
-              <w:t>6</w:t>
+              <w:t xml:space="preserve">Dez 2026</w:t>
             </w:r>
           </w:p>
         </w:tc>
@@ -521,21 +412,7 @@
               <w:rPr>
                 <w:b/>
               </w:rPr>
-              <w:t>Nome</w:t>
-            </w:r>
-            <w:r>
-              <w:rPr>
-                <w:b/>
-                <w:spacing w:val="1"/>
-              </w:rPr>
-              <w:t xml:space="preserve"> </w:t>
-            </w:r>
-            <w:r>
-              <w:rPr>
-                <w:b/>
-                <w:spacing w:val="-2"/>
-              </w:rPr>
-              <w:t>Completo</w:t>
+              <w:t xml:space="preserve">Nome Completo</w:t>
             </w:r>
           </w:p>
         </w:tc>
@@ -669,14 +546,7 @@
                 <w:b/>
                 <w:spacing w:val="-2"/>
               </w:rPr>
-              <w:t>E-mail:</w:t>
-            </w:r>
-            <w:r>
-              <w:rPr>
-                <w:b/>
-                <w:spacing w:val="34"/>
-              </w:rPr>
-              <w:t xml:space="preserve"> </w:t>
+              <w:t xml:space="preserve">E-mail: </w:t>
             </w:r>
           </w:p>
         </w:tc>
@@ -814,40 +684,7 @@
               <w:rPr>
                 <w:b/>
               </w:rPr>
-              <w:t>Endereço</w:t>
-            </w:r>
-            <w:r>
-              <w:rPr>
-                <w:b/>
-                <w:spacing w:val="-4"/>
-              </w:rPr>
-              <w:t xml:space="preserve"> </w:t>
-            </w:r>
-            <w:r>
-              <w:rPr>
-                <w:b/>
-              </w:rPr>
-              <w:t>Completo</w:t>
-            </w:r>
-            <w:r>
-              <w:rPr>
-                <w:b/>
-                <w:spacing w:val="-6"/>
-              </w:rPr>
-              <w:t xml:space="preserve"> </w:t>
-            </w:r>
-            <w:r>
-              <w:rPr>
-                <w:b/>
-              </w:rPr>
-              <w:t xml:space="preserve">e </w:t>
-            </w:r>
-            <w:r>
-              <w:rPr>
-                <w:b/>
-                <w:spacing w:val="-5"/>
-              </w:rPr>
-              <w:t>CEP</w:t>
+              <w:t xml:space="preserve">Endereço Completo e CEP</w:t>
             </w:r>
           </w:p>
         </w:tc>
@@ -910,34 +747,7 @@
               <w:rPr>
                 <w:b/>
               </w:rPr>
-              <w:t>Data</w:t>
-            </w:r>
-            <w:r>
-              <w:rPr>
-                <w:b/>
-                <w:spacing w:val="1"/>
-              </w:rPr>
-              <w:t xml:space="preserve"> </w:t>
-            </w:r>
-            <w:r>
-              <w:rPr>
-                <w:b/>
-              </w:rPr>
-              <w:t>de</w:t>
-            </w:r>
-            <w:r>
-              <w:rPr>
-                <w:b/>
-                <w:spacing w:val="-4"/>
-              </w:rPr>
-              <w:t xml:space="preserve"> </w:t>
-            </w:r>
-            <w:r>
-              <w:rPr>
-                <w:b/>
-                <w:spacing w:val="-2"/>
-              </w:rPr>
-              <w:t>Nascimento</w:t>
+              <w:t xml:space="preserve">Data de Nascimento</w:t>
             </w:r>
           </w:p>
         </w:tc>
@@ -973,52 +783,7 @@
                 <w:rFonts w:ascii="Arial MT" w:hAnsi="Arial MT"/>
                 <w:sz w:val="24"/>
               </w:rPr>
-              <w:t>(exemplo) Rua</w:t>
-            </w:r>
-            <w:r>
-              <w:rPr>
-                <w:rFonts w:ascii="Arial MT" w:hAnsi="Arial MT"/>
-                <w:spacing w:val="-3"/>
-                <w:sz w:val="24"/>
-              </w:rPr>
-              <w:t xml:space="preserve"> </w:t>
-            </w:r>
-            <w:r>
-              <w:rPr>
-                <w:rFonts w:ascii="Arial MT" w:hAnsi="Arial MT"/>
-                <w:sz w:val="24"/>
-              </w:rPr>
-              <w:t>Senador</w:t>
-            </w:r>
-            <w:r>
-              <w:rPr>
-                <w:rFonts w:ascii="Arial MT" w:hAnsi="Arial MT"/>
-                <w:spacing w:val="-6"/>
-                <w:sz w:val="24"/>
-              </w:rPr>
-              <w:t xml:space="preserve"> </w:t>
-            </w:r>
-            <w:r>
-              <w:rPr>
-                <w:rFonts w:ascii="Arial MT" w:hAnsi="Arial MT"/>
-                <w:sz w:val="24"/>
-              </w:rPr>
-              <w:t>Ponce,</w:t>
-            </w:r>
-            <w:r>
-              <w:rPr>
-                <w:rFonts w:ascii="Arial MT" w:hAnsi="Arial MT"/>
-                <w:spacing w:val="-2"/>
-                <w:sz w:val="24"/>
-              </w:rPr>
-              <w:t xml:space="preserve"> </w:t>
-            </w:r>
-            <w:r>
-              <w:rPr>
-                <w:rFonts w:ascii="Arial MT" w:hAnsi="Arial MT"/>
-                <w:sz w:val="24"/>
-              </w:rPr>
-              <w:t>294</w:t>
+              <w:t xml:space="preserve">{endereco}</w:t>
             </w:r>
           </w:p>
         </w:tc>
@@ -1193,22 +958,7 @@
                 <w:rFonts w:ascii="Arial MT" w:hAnsi="Arial MT"/>
                 <w:sz w:val="24"/>
               </w:rPr>
-              <w:t>(exemplo) Apto 33, Monte</w:t>
-            </w:r>
-            <w:r>
-              <w:rPr>
-                <w:rFonts w:ascii="Arial MT" w:hAnsi="Arial MT"/>
-                <w:spacing w:val="-2"/>
-                <w:sz w:val="24"/>
-              </w:rPr>
-              <w:t xml:space="preserve"> </w:t>
-            </w:r>
-            <w:r>
-              <w:rPr>
-                <w:rFonts w:ascii="Arial MT" w:hAnsi="Arial MT"/>
-                <w:sz w:val="24"/>
-              </w:rPr>
-              <w:t>Verde</w:t>
+              <w:t xml:space="preserve">{complemento_bairro}</w:t>
             </w:r>
           </w:p>
         </w:tc>
@@ -1241,23 +991,7 @@
                 <w:spacing w:val="-2"/>
                 <w:sz w:val="24"/>
               </w:rPr>
-              <w:t>(exemplo) Ja</w:t>
-            </w:r>
-            <w:r>
-              <w:rPr>
-                <w:rFonts w:ascii="Arial MT"/>
-                <w:spacing w:val="-2"/>
-                <w:sz w:val="24"/>
-              </w:rPr>
-              <w:t>ú</w:t>
-            </w:r>
-            <w:r>
-              <w:rPr>
-                <w:rFonts w:ascii="Arial MT"/>
-                <w:spacing w:val="-2"/>
-                <w:sz w:val="24"/>
-              </w:rPr>
-              <w:t xml:space="preserve"> - SP</w:t>
+              <w:t xml:space="preserve">{cidade_estado}</w:t>
             </w:r>
           </w:p>
         </w:tc>
@@ -1291,34 +1025,7 @@
               <w:rPr>
                 <w:b/>
               </w:rPr>
-              <w:t>Número</w:t>
-            </w:r>
-            <w:r>
-              <w:rPr>
-                <w:b/>
-                <w:spacing w:val="-3"/>
-              </w:rPr>
-              <w:t xml:space="preserve"> </w:t>
-            </w:r>
-            <w:r>
-              <w:rPr>
-                <w:b/>
-              </w:rPr>
-              <w:t>da</w:t>
-            </w:r>
-            <w:r>
-              <w:rPr>
-                <w:b/>
-                <w:spacing w:val="-1"/>
-              </w:rPr>
-              <w:t xml:space="preserve"> </w:t>
-            </w:r>
-            <w:r>
-              <w:rPr>
-                <w:b/>
-                <w:spacing w:val="-2"/>
-              </w:rPr>
-              <w:t>demanda</w:t>
+              <w:t xml:space="preserve">Número da demanda</w:t>
             </w:r>
           </w:p>
         </w:tc>
@@ -1346,34 +1053,7 @@
               <w:rPr>
                 <w:b/>
               </w:rPr>
-              <w:t>Vigência</w:t>
-            </w:r>
-            <w:r>
-              <w:rPr>
-                <w:b/>
-                <w:spacing w:val="-2"/>
-              </w:rPr>
-              <w:t xml:space="preserve"> </w:t>
-            </w:r>
-            <w:r>
-              <w:rPr>
-                <w:b/>
-              </w:rPr>
-              <w:t>do</w:t>
-            </w:r>
-            <w:r>
-              <w:rPr>
-                <w:b/>
-                <w:spacing w:val="-11"/>
-              </w:rPr>
-              <w:t xml:space="preserve"> </w:t>
-            </w:r>
-            <w:r>
-              <w:rPr>
-                <w:b/>
-                <w:spacing w:val="-5"/>
-              </w:rPr>
-              <w:t>POA</w:t>
+              <w:t xml:space="preserve">Vigência do POA</w:t>
             </w:r>
           </w:p>
         </w:tc>
@@ -1409,14 +1089,7 @@
                 <w:b/>
                 <w:spacing w:val="-2"/>
               </w:rPr>
-              <w:t>DE-ASL2-POA2-XXX-2026-</w:t>
-            </w:r>
-            <w:r>
-              <w:rPr>
-                <w:b/>
-                <w:spacing w:val="-4"/>
-              </w:rPr>
-              <w:t>00XX</w:t>
+              <w:t>{numero_demanda}</w:t>
             </w:r>
           </w:p>
         </w:tc>
@@ -1445,14 +1118,7 @@
               <w:rPr>
                 <w:b/>
               </w:rPr>
-              <w:t>2024-</w:t>
-            </w:r>
-            <w:r>
-              <w:rPr>
-                <w:b/>
-                <w:spacing w:val="-5"/>
-              </w:rPr>
-              <w:t>25</w:t>
+              <w:t>{vigencia_poa}</w:t>
             </w:r>
           </w:p>
         </w:tc>
@@ -1485,31 +1151,7 @@
               <w:rPr>
                 <w:b/>
               </w:rPr>
-              <w:t>Linha(s)</w:t>
-            </w:r>
-            <w:r>
-              <w:rPr>
-                <w:b/>
-              </w:rPr>
-              <w:t xml:space="preserve"> </w:t>
-            </w:r>
-            <w:r>
-              <w:rPr>
-                <w:b/>
-              </w:rPr>
-              <w:t>do</w:t>
-            </w:r>
-            <w:r>
-              <w:rPr>
-                <w:b/>
-              </w:rPr>
-              <w:t xml:space="preserve"> </w:t>
-            </w:r>
-            <w:r>
-              <w:rPr>
-                <w:b/>
-              </w:rPr>
-              <w:t>POA:</w:t>
+              <w:t xml:space="preserve">Linha(s) do POA:</w:t>
             </w:r>
           </w:p>
         </w:tc>
@@ -1538,14 +1180,7 @@
               <w:rPr>
                 <w:b/>
               </w:rPr>
-              <w:t>SEI:</w:t>
-            </w:r>
-            <w:r>
-              <w:rPr>
-                <w:b/>
-                <w:spacing w:val="-8"/>
-              </w:rPr>
-              <w:t xml:space="preserve"> </w:t>
+              <w:t xml:space="preserve">SEI: </w:t>
             </w:r>
           </w:p>
         </w:tc>
@@ -1578,11 +1213,7 @@
               </w:rPr>
             </w:pPr>
             <w:r>
-              <w:rPr>
-                <w:rFonts w:ascii="Arial MT" w:hAnsi="Arial MT"/>
-                <w:sz w:val="20"/>
-              </w:rPr>
-              <w:t>-</w:t>
+              <w:t>{linhas_poa}</w:t>
             </w:r>
           </w:p>
         </w:tc>
@@ -1609,11 +1240,7 @@
               </w:rPr>
             </w:pPr>
             <w:r>
-              <w:rPr>
-                <w:rFonts w:ascii="Arial MT" w:hAnsi="Arial MT"/>
-                <w:sz w:val="20"/>
-              </w:rPr>
-              <w:t>-</w:t>
+              <w:t>{sei}</w:t>
             </w:r>
           </w:p>
         </w:tc>
@@ -1675,27 +1302,7 @@
               <w:rPr>
                 <w:b/>
               </w:rPr>
-              <w:t>Proc</w:t>
-            </w:r>
-            <w:r>
-              <w:rPr>
-                <w:b/>
-                <w:spacing w:val="-8"/>
-              </w:rPr>
-              <w:t xml:space="preserve"> </w:t>
-            </w:r>
-            <w:r>
-              <w:rPr>
-                <w:b/>
-              </w:rPr>
-              <w:t>nº</w:t>
-            </w:r>
-            <w:r>
-              <w:rPr>
-                <w:b/>
-                <w:spacing w:val="-8"/>
-              </w:rPr>
-              <w:t xml:space="preserve"> </w:t>
+              <w:t xml:space="preserve">Proc nº </w:t>
             </w:r>
           </w:p>
         </w:tc>
@@ -1726,6 +1333,9 @@
                 <w:rFonts w:ascii="Arial MT" w:hAnsi="Arial MT"/>
               </w:rPr>
             </w:pPr>
+            <w:r>
+              <w:t>{componente}</w:t>
+            </w:r>
           </w:p>
         </w:tc>
         <w:tc>
@@ -1750,10 +1360,7 @@
               </w:rPr>
             </w:pPr>
             <w:r>
-              <w:rPr>
-                <w:rFonts w:ascii="Arial MT" w:hAnsi="Arial MT"/>
-              </w:rPr>
-              <w:t>-</w:t>
+              <w:t>{proc_numero}</w:t>
             </w:r>
           </w:p>
         </w:tc>
@@ -1854,25 +1461,7 @@
                 <w:sz w:val="24"/>
                 <w:szCs w:val="24"/>
               </w:rPr>
-              <w:t>DADOS</w:t>
-            </w:r>
-            <w:r>
-              <w:rPr>
-                <w:b/>
-                <w:spacing w:val="-1"/>
-                <w:sz w:val="24"/>
-                <w:szCs w:val="24"/>
-              </w:rPr>
-              <w:t xml:space="preserve"> </w:t>
-            </w:r>
-            <w:r>
-              <w:rPr>
-                <w:b/>
-                <w:spacing w:val="-2"/>
-                <w:sz w:val="24"/>
-                <w:szCs w:val="24"/>
-              </w:rPr>
-              <w:t>BANCÁRIOS</w:t>
+              <w:t xml:space="preserve">DADOS BANCÁRIOS</w:t>
             </w:r>
           </w:p>
         </w:tc>
@@ -1909,14 +1498,7 @@
                 <w:b/>
                 <w:sz w:val="24"/>
               </w:rPr>
-              <w:t xml:space="preserve">Nome do </w:t>
-            </w:r>
-            <w:r>
-              <w:rPr>
-                <w:b/>
-                <w:sz w:val="24"/>
-              </w:rPr>
-              <w:t>Banco</w:t>
+              <w:t xml:space="preserve">Nome do Banco</w:t>
             </w:r>
           </w:p>
         </w:tc>
@@ -2146,7 +1728,7 @@
                 <w:spacing w:val="-2"/>
                 <w:sz w:val="24"/>
               </w:rPr>
-              <w:t>XXX</w:t>
+              <w:t>{codigo_banco}</w:t>
             </w:r>
           </w:p>
         </w:tc>
@@ -2207,12 +1789,7 @@
               </w:rPr>
             </w:pPr>
             <w:r>
-              <w:rPr>
-                <w:b/>
-                <w:spacing w:val="-2"/>
-                <w:sz w:val="24"/>
-              </w:rPr>
-              <w:t>X</w:t>
+              <w:t>{agencia_digito}</w:t>
             </w:r>
           </w:p>
         </w:tc>
@@ -2273,12 +1850,7 @@
               </w:rPr>
             </w:pPr>
             <w:r>
-              <w:rPr>
-                <w:b/>
-                <w:spacing w:val="-2"/>
-                <w:sz w:val="24"/>
-              </w:rPr>
-              <w:t>X</w:t>
+              <w:t>{conta_digito}</w:t>
             </w:r>
           </w:p>
         </w:tc>
@@ -2380,11 +1952,7 @@
               </w:rPr>
             </w:pPr>
             <w:r>
-              <w:rPr>
-                <w:rFonts w:ascii="Arial" w:hAnsi="Arial" w:cs="Arial"/>
-                <w:color w:val="000000" w:themeColor="text1"/>
-              </w:rPr>
-              <w:t>A justificativa deverá conter, de forma clara e objetiva, a identificação da atividade ou evento (nome), as datas de início e término da atividade, as datas de realização do evento, bem como o município onde a atividade ou o evento será realizado.</w:t>
+              <w:t>{justificativa}</w:t>
             </w:r>
           </w:p>
         </w:tc>
@@ -2477,136 +2045,7 @@
                 <w:sz w:val="26"/>
                 <w:szCs w:val="26"/>
               </w:rPr>
-              <w:t>1.</w:t>
-            </w:r>
-            <w:r>
-              <w:rPr>
-                <w:b/>
-                <w:spacing w:val="74"/>
-                <w:w w:val="150"/>
-                <w:sz w:val="26"/>
-                <w:szCs w:val="26"/>
-              </w:rPr>
-              <w:t xml:space="preserve"> </w:t>
-            </w:r>
-            <w:r>
-              <w:rPr>
-                <w:b/>
-                <w:sz w:val="26"/>
-                <w:szCs w:val="26"/>
-              </w:rPr>
-              <w:t>DADOS</w:t>
-            </w:r>
-            <w:r>
-              <w:rPr>
-                <w:b/>
-                <w:spacing w:val="-2"/>
-                <w:sz w:val="26"/>
-                <w:szCs w:val="26"/>
-              </w:rPr>
-              <w:t xml:space="preserve"> </w:t>
-            </w:r>
-            <w:r>
-              <w:rPr>
-                <w:b/>
-                <w:sz w:val="26"/>
-                <w:szCs w:val="26"/>
-              </w:rPr>
-              <w:t>DA</w:t>
-            </w:r>
-            <w:r>
-              <w:rPr>
-                <w:b/>
-                <w:spacing w:val="-7"/>
-                <w:sz w:val="26"/>
-                <w:szCs w:val="26"/>
-              </w:rPr>
-              <w:t xml:space="preserve"> </w:t>
-            </w:r>
-            <w:r>
-              <w:rPr>
-                <w:b/>
-                <w:sz w:val="26"/>
-                <w:szCs w:val="26"/>
-              </w:rPr>
-              <w:t>PASSAGEM</w:t>
-            </w:r>
-            <w:r>
-              <w:rPr>
-                <w:b/>
-                <w:spacing w:val="-3"/>
-                <w:sz w:val="26"/>
-                <w:szCs w:val="26"/>
-              </w:rPr>
-              <w:t xml:space="preserve"> </w:t>
-            </w:r>
-            <w:r>
-              <w:rPr>
-                <w:b/>
-                <w:sz w:val="26"/>
-                <w:szCs w:val="26"/>
-              </w:rPr>
-              <w:t>AÉREA</w:t>
-            </w:r>
-            <w:r>
-              <w:rPr>
-                <w:b/>
-                <w:spacing w:val="-2"/>
-                <w:sz w:val="26"/>
-                <w:szCs w:val="26"/>
-              </w:rPr>
-              <w:t xml:space="preserve"> </w:t>
-            </w:r>
-            <w:r>
-              <w:rPr>
-                <w:b/>
-                <w:sz w:val="26"/>
-                <w:szCs w:val="26"/>
-              </w:rPr>
-              <w:t>NACIONAL</w:t>
-            </w:r>
-            <w:r>
-              <w:rPr>
-                <w:b/>
-                <w:spacing w:val="-6"/>
-                <w:sz w:val="26"/>
-                <w:szCs w:val="26"/>
-              </w:rPr>
-              <w:t xml:space="preserve"> </w:t>
-            </w:r>
-            <w:r>
-              <w:rPr>
-                <w:b/>
-                <w:sz w:val="26"/>
-                <w:szCs w:val="26"/>
-              </w:rPr>
-              <w:t>E</w:t>
-            </w:r>
-            <w:r>
-              <w:rPr>
-                <w:b/>
-                <w:spacing w:val="-2"/>
-                <w:sz w:val="26"/>
-                <w:szCs w:val="26"/>
-              </w:rPr>
-              <w:t xml:space="preserve"> </w:t>
-            </w:r>
-            <w:r>
-              <w:rPr>
-                <w:b/>
-                <w:sz w:val="26"/>
-                <w:szCs w:val="26"/>
-              </w:rPr>
-              <w:t>OU</w:t>
-            </w:r>
-            <w:r>
-              <w:rPr>
-                <w:b/>
-                <w:spacing w:val="-2"/>
-                <w:sz w:val="26"/>
-                <w:szCs w:val="26"/>
-              </w:rPr>
-              <w:t xml:space="preserve"> INTERNACIONAL</w:t>
+              <w:t xml:space="preserve">1. DADOS DA PASSAGEM AÉREA NACIONAL E OU INTERNACIONAL</w:t>
             </w:r>
           </w:p>
         </w:tc>
@@ -2835,21 +2274,7 @@
               <w:rPr>
                 <w:b/>
               </w:rPr>
-              <w:t>Vôo/</w:t>
-            </w:r>
-            <w:r>
-              <w:rPr>
-                <w:b/>
-                <w:spacing w:val="-1"/>
-              </w:rPr>
-              <w:t xml:space="preserve"> </w:t>
-            </w:r>
-            <w:r>
-              <w:rPr>
-                <w:b/>
-                <w:spacing w:val="-4"/>
-              </w:rPr>
-              <w:t>Hora</w:t>
+              <w:t xml:space="preserve">Vôo/ Hora</w:t>
             </w:r>
           </w:p>
         </w:tc>
@@ -2904,21 +2329,7 @@
               <w:rPr>
                 <w:b/>
               </w:rPr>
-              <w:t>Vôo/</w:t>
-            </w:r>
-            <w:r>
-              <w:rPr>
-                <w:b/>
-                <w:spacing w:val="-1"/>
-              </w:rPr>
-              <w:t xml:space="preserve"> </w:t>
-            </w:r>
-            <w:r>
-              <w:rPr>
-                <w:b/>
-                <w:spacing w:val="-4"/>
-              </w:rPr>
-              <w:t>Hora</w:t>
+              <w:t xml:space="preserve">Vôo/ Hora</w:t>
             </w:r>
           </w:p>
         </w:tc>
@@ -2952,21 +2363,7 @@
               <w:rPr>
                 <w:rFonts w:ascii="Arial MT"/>
               </w:rPr>
-              <w:t>Campo</w:t>
-            </w:r>
-            <w:r>
-              <w:rPr>
-                <w:rFonts w:ascii="Arial MT"/>
-                <w:spacing w:val="-3"/>
-              </w:rPr>
-              <w:t xml:space="preserve"> </w:t>
-            </w:r>
-            <w:r>
-              <w:rPr>
-                <w:rFonts w:ascii="Arial MT"/>
-                <w:spacing w:val="-2"/>
-              </w:rPr>
-              <w:t>Grande</w:t>
+              <w:t xml:space="preserve">{passagem_orig_1}</w:t>
             </w:r>
           </w:p>
         </w:tc>
@@ -3162,21 +2559,7 @@
               <w:rPr>
                 <w:rFonts w:ascii="Arial MT"/>
               </w:rPr>
-              <w:t>Campo</w:t>
-            </w:r>
-            <w:r>
-              <w:rPr>
-                <w:rFonts w:ascii="Arial MT"/>
-                <w:spacing w:val="-3"/>
-              </w:rPr>
-              <w:t xml:space="preserve"> </w:t>
-            </w:r>
-            <w:r>
-              <w:rPr>
-                <w:rFonts w:ascii="Arial MT"/>
-                <w:spacing w:val="-2"/>
-              </w:rPr>
-              <w:t>Grande</w:t>
+              <w:t xml:space="preserve">{passagem_dest_1}</w:t>
             </w:r>
           </w:p>
         </w:tc>
@@ -3520,21 +2903,7 @@
               <w:rPr>
                 <w:b/>
               </w:rPr>
-              <w:t>Nome do</w:t>
-            </w:r>
-            <w:r>
-              <w:rPr>
-                <w:b/>
-                <w:spacing w:val="-6"/>
-              </w:rPr>
-              <w:t xml:space="preserve"> </w:t>
-            </w:r>
-            <w:r>
-              <w:rPr>
-                <w:b/>
-                <w:spacing w:val="-2"/>
-              </w:rPr>
-              <w:t>Solicitante</w:t>
+              <w:t xml:space="preserve">Nome do Solicitante</w:t>
             </w:r>
           </w:p>
         </w:tc>
@@ -3565,34 +2934,7 @@
               <w:rPr>
                 <w:b/>
               </w:rPr>
-              <w:t>Unidade</w:t>
-            </w:r>
-            <w:r>
-              <w:rPr>
-                <w:b/>
-                <w:spacing w:val="-2"/>
-              </w:rPr>
-              <w:t xml:space="preserve"> </w:t>
-            </w:r>
-            <w:r>
-              <w:rPr>
-                <w:b/>
-              </w:rPr>
-              <w:t>do</w:t>
-            </w:r>
-            <w:r>
-              <w:rPr>
-                <w:b/>
-                <w:spacing w:val="-4"/>
-              </w:rPr>
-              <w:t xml:space="preserve"> </w:t>
-            </w:r>
-            <w:r>
-              <w:rPr>
-                <w:b/>
-                <w:spacing w:val="-2"/>
-              </w:rPr>
-              <w:t>Solicitante</w:t>
+              <w:t xml:space="preserve">Unidade do Solicitante</w:t>
             </w:r>
           </w:p>
         </w:tc>
@@ -3621,60 +2963,7 @@
               <w:rPr>
                 <w:b/>
               </w:rPr>
-              <w:t>Valor</w:t>
-            </w:r>
-            <w:r>
-              <w:rPr>
-                <w:b/>
-                <w:spacing w:val="-7"/>
-              </w:rPr>
-              <w:t xml:space="preserve"> </w:t>
-            </w:r>
-            <w:r>
-              <w:rPr>
-                <w:b/>
-              </w:rPr>
-              <w:t>total</w:t>
-            </w:r>
-            <w:r>
-              <w:rPr>
-                <w:b/>
-                <w:spacing w:val="-5"/>
-              </w:rPr>
-              <w:t xml:space="preserve"> </w:t>
-            </w:r>
-            <w:r>
-              <w:rPr>
-                <w:b/>
-              </w:rPr>
-              <w:t>da</w:t>
-            </w:r>
-            <w:r>
-              <w:rPr>
-                <w:b/>
-                <w:spacing w:val="-1"/>
-              </w:rPr>
-              <w:t xml:space="preserve"> </w:t>
-            </w:r>
-            <w:r>
-              <w:rPr>
-                <w:b/>
-              </w:rPr>
-              <w:t>passagem</w:t>
-            </w:r>
-            <w:r>
-              <w:rPr>
-                <w:b/>
-                <w:spacing w:val="-6"/>
-              </w:rPr>
-              <w:t xml:space="preserve"> </w:t>
-            </w:r>
-            <w:r>
-              <w:rPr>
-                <w:b/>
-                <w:spacing w:val="-4"/>
-              </w:rPr>
-              <w:t>aérea</w:t>
+              <w:t xml:space="preserve">Valor total da passagem aérea</w:t>
             </w:r>
           </w:p>
         </w:tc>
@@ -3740,7 +3029,7 @@
                 <w:rFonts w:ascii="Arial MT"/>
                 <w:spacing w:val="-2"/>
               </w:rPr>
-              <w:t>{conta}/MMA</w:t>
+              <w:t>{unidade_solicitante}</w:t>
             </w:r>
           </w:p>
         </w:tc>
@@ -3769,14 +3058,7 @@
               <w:rPr>
                 <w:b/>
               </w:rPr>
-              <w:t xml:space="preserve">R$ </w:t>
-            </w:r>
-            <w:r>
-              <w:rPr>
-                <w:b/>
-                <w:spacing w:val="-10"/>
-              </w:rPr>
-              <w:t>-</w:t>
+              <w:t xml:space="preserve">{total_passagem}</w:t>
             </w:r>
           </w:p>
         </w:tc>
@@ -3924,20 +3206,7 @@
               <w:rPr>
                 <w:rFonts w:ascii="Arial MT"/>
               </w:rPr>
-              <w:t xml:space="preserve"> com despacho de</w:t>
-            </w:r>
-            <w:r>
-              <w:rPr>
-                <w:rFonts w:ascii="Arial MT"/>
-                <w:spacing w:val="-2"/>
-              </w:rPr>
-              <w:t xml:space="preserve"> </w:t>
-            </w:r>
-            <w:r>
-              <w:rPr>
-                <w:rFonts w:ascii="Arial MT"/>
-              </w:rPr>
-              <w:t>bagagem</w:t>
+              <w:t xml:space="preserve"> com despacho de bagagem</w:t>
             </w:r>
           </w:p>
         </w:tc>
@@ -4095,52 +3364,7 @@
               <w:rPr>
                 <w:b/>
               </w:rPr>
-              <w:t xml:space="preserve"> </w:t>
-            </w:r>
-            <w:r>
-              <w:rPr>
-                <w:rFonts w:ascii="Arial MT"/>
-              </w:rPr>
-              <w:t>sem</w:t>
-            </w:r>
-            <w:r>
-              <w:rPr>
-                <w:rFonts w:ascii="Arial MT"/>
-                <w:spacing w:val="-7"/>
-              </w:rPr>
-              <w:t xml:space="preserve"> </w:t>
-            </w:r>
-            <w:r>
-              <w:rPr>
-                <w:rFonts w:ascii="Arial MT"/>
-              </w:rPr>
-              <w:t>despacho</w:t>
-            </w:r>
-            <w:r>
-              <w:rPr>
-                <w:rFonts w:ascii="Arial MT"/>
-                <w:spacing w:val="-8"/>
-              </w:rPr>
-              <w:t xml:space="preserve"> </w:t>
-            </w:r>
-            <w:r>
-              <w:rPr>
-                <w:rFonts w:ascii="Arial MT"/>
-              </w:rPr>
-              <w:t>de</w:t>
-            </w:r>
-            <w:r>
-              <w:rPr>
-                <w:rFonts w:ascii="Arial MT"/>
-                <w:spacing w:val="-4"/>
-              </w:rPr>
-              <w:t xml:space="preserve"> </w:t>
-            </w:r>
-            <w:r>
-              <w:rPr>
-                <w:rFonts w:ascii="Arial MT"/>
-              </w:rPr>
-              <w:t>bagagem</w:t>
+              <w:t xml:space="preserve"> sem despacho de bagagem</w:t>
             </w:r>
           </w:p>
         </w:tc>
@@ -4584,21 +3808,7 @@
               <w:rPr>
                 <w:rFonts w:ascii="Arial MT"/>
               </w:rPr>
-              <w:t>Campo</w:t>
-            </w:r>
-            <w:r>
-              <w:rPr>
-                <w:rFonts w:ascii="Arial MT"/>
-                <w:spacing w:val="-3"/>
-              </w:rPr>
-              <w:t xml:space="preserve"> </w:t>
-            </w:r>
-            <w:r>
-              <w:rPr>
-                <w:rFonts w:ascii="Arial MT"/>
-                <w:spacing w:val="-2"/>
-              </w:rPr>
-              <w:t>Grande</w:t>
+              <w:t xml:space="preserve">{passagem_orig_2}</w:t>
             </w:r>
           </w:p>
         </w:tc>
@@ -4796,21 +4006,7 @@
               <w:rPr>
                 <w:rFonts w:ascii="Arial MT"/>
               </w:rPr>
-              <w:t>Campo</w:t>
-            </w:r>
-            <w:r>
-              <w:rPr>
-                <w:rFonts w:ascii="Arial MT"/>
-                <w:spacing w:val="-3"/>
-              </w:rPr>
-              <w:t xml:space="preserve"> </w:t>
-            </w:r>
-            <w:r>
-              <w:rPr>
-                <w:rFonts w:ascii="Arial MT"/>
-                <w:spacing w:val="-2"/>
-              </w:rPr>
-              <w:t>Grande</w:t>
+              <w:t xml:space="preserve">{passagem_dest_2}</w:t>
             </w:r>
           </w:p>
         </w:tc>
@@ -5160,42 +4356,7 @@
                 <w:sz w:val="24"/>
                 <w:szCs w:val="24"/>
               </w:rPr>
-              <w:t>Tipo</w:t>
-            </w:r>
-            <w:r>
-              <w:rPr>
-                <w:b/>
-                <w:spacing w:val="-4"/>
-                <w:sz w:val="24"/>
-                <w:szCs w:val="24"/>
-              </w:rPr>
-              <w:t xml:space="preserve"> </w:t>
-            </w:r>
-            <w:r>
-              <w:rPr>
-                <w:b/>
-                <w:sz w:val="24"/>
-                <w:szCs w:val="24"/>
-              </w:rPr>
-              <w:t>de</w:t>
-            </w:r>
-            <w:r>
-              <w:rPr>
-                <w:b/>
-                <w:spacing w:val="5"/>
-                <w:sz w:val="24"/>
-                <w:szCs w:val="24"/>
-              </w:rPr>
-              <w:t xml:space="preserve"> </w:t>
-            </w:r>
-            <w:r>
-              <w:rPr>
-                <w:b/>
-                <w:spacing w:val="-2"/>
-                <w:sz w:val="24"/>
-                <w:szCs w:val="24"/>
-              </w:rPr>
-              <w:t>transporte terrestre:</w:t>
+              <w:t xml:space="preserve">Tipo de transporte terrestre:</w:t>
             </w:r>
           </w:p>
         </w:tc>
@@ -5230,41 +4391,7 @@
                 <w:sz w:val="24"/>
                 <w:szCs w:val="24"/>
               </w:rPr>
-              <w:t>Tipo</w:t>
-            </w:r>
-            <w:r>
-              <w:rPr>
-                <w:b/>
-                <w:spacing w:val="-16"/>
-                <w:sz w:val="24"/>
-                <w:szCs w:val="24"/>
-              </w:rPr>
-              <w:t xml:space="preserve"> </w:t>
-            </w:r>
-            <w:r>
-              <w:rPr>
-                <w:b/>
-                <w:sz w:val="24"/>
-                <w:szCs w:val="24"/>
-              </w:rPr>
-              <w:t>de</w:t>
-            </w:r>
-            <w:r>
-              <w:rPr>
-                <w:b/>
-                <w:spacing w:val="-15"/>
-                <w:sz w:val="24"/>
-                <w:szCs w:val="24"/>
-              </w:rPr>
-              <w:t xml:space="preserve"> </w:t>
-            </w:r>
-            <w:r>
-              <w:rPr>
-                <w:b/>
-                <w:sz w:val="24"/>
-                <w:szCs w:val="24"/>
-              </w:rPr>
-              <w:t>transporte fluvial:</w:t>
+              <w:t xml:space="preserve">Tipo de transporte fluvial:</w:t>
             </w:r>
           </w:p>
         </w:tc>
@@ -5299,49 +4426,7 @@
                 <w:sz w:val="24"/>
                 <w:szCs w:val="24"/>
               </w:rPr>
-              <w:t xml:space="preserve">                            </w:t>
-            </w:r>
-            <w:r>
-              <w:rPr>
-                <w:b/>
-                <w:sz w:val="24"/>
-                <w:szCs w:val="24"/>
-              </w:rPr>
-              <w:t>Valor</w:t>
-            </w:r>
-            <w:r>
-              <w:rPr>
-                <w:b/>
-                <w:spacing w:val="-7"/>
-                <w:sz w:val="24"/>
-                <w:szCs w:val="24"/>
-              </w:rPr>
-              <w:t xml:space="preserve"> </w:t>
-            </w:r>
-            <w:r>
-              <w:rPr>
-                <w:b/>
-                <w:sz w:val="24"/>
-                <w:szCs w:val="24"/>
-              </w:rPr>
-              <w:t>total</w:t>
-            </w:r>
-            <w:r>
-              <w:rPr>
-                <w:b/>
-                <w:spacing w:val="-5"/>
-                <w:sz w:val="24"/>
-                <w:szCs w:val="24"/>
-              </w:rPr>
-              <w:t xml:space="preserve"> </w:t>
-            </w:r>
-            <w:r>
-              <w:rPr>
-                <w:b/>
-                <w:sz w:val="24"/>
-                <w:szCs w:val="24"/>
-              </w:rPr>
-              <w:t>da</w:t>
+              <w:t xml:space="preserve">                            Valor total da</w:t>
             </w:r>
           </w:p>
           <w:p>
@@ -5362,23 +4447,7 @@
                 <w:sz w:val="24"/>
                 <w:szCs w:val="24"/>
               </w:rPr>
-              <w:t xml:space="preserve">                            </w:t>
-            </w:r>
-            <w:r>
-              <w:rPr>
-                <w:b/>
-                <w:sz w:val="24"/>
-                <w:szCs w:val="24"/>
-              </w:rPr>
-              <w:t>passage</w:t>
-            </w:r>
-            <w:r>
-              <w:rPr>
-                <w:b/>
-                <w:sz w:val="24"/>
-                <w:szCs w:val="24"/>
-              </w:rPr>
-              <w:t>m</w:t>
+              <w:t xml:space="preserve">                            passagem</w:t>
             </w:r>
           </w:p>
         </w:tc>
@@ -5438,21 +4507,7 @@
               <w:rPr>
                 <w:rFonts w:ascii="Arial MT" w:hAnsi="Arial MT"/>
               </w:rPr>
-              <w:t>Veículo</w:t>
-            </w:r>
-            <w:r>
-              <w:rPr>
-                <w:rFonts w:ascii="Arial MT" w:hAnsi="Arial MT"/>
-                <w:spacing w:val="-1"/>
-              </w:rPr>
-              <w:t xml:space="preserve"> </w:t>
-            </w:r>
-            <w:r>
-              <w:rPr>
-                <w:rFonts w:ascii="Arial MT" w:hAnsi="Arial MT"/>
-                <w:spacing w:val="-2"/>
-              </w:rPr>
-              <w:t>Oficial;</w:t>
+              <w:t xml:space="preserve">Veículo Oficial;</w:t>
             </w:r>
           </w:p>
         </w:tc>
@@ -5551,15 +4606,7 @@
                 <w:sz w:val="26"/>
                 <w:szCs w:val="26"/>
               </w:rPr>
-              <w:t xml:space="preserve">R$ </w:t>
-            </w:r>
-            <w:r>
-              <w:rPr>
-                <w:b/>
-                <w:sz w:val="26"/>
-                <w:szCs w:val="26"/>
-              </w:rPr>
-              <w:t>-</w:t>
+              <w:t xml:space="preserve">{total_transporte}</w:t>
             </w:r>
           </w:p>
         </w:tc>
@@ -5619,20 +4666,7 @@
               <w:rPr>
                 <w:rFonts w:ascii="Arial MT" w:hAnsi="Arial MT"/>
               </w:rPr>
-              <w:t>Veículo</w:t>
-            </w:r>
-            <w:r>
-              <w:rPr>
-                <w:rFonts w:ascii="Arial MT" w:hAnsi="Arial MT"/>
-                <w:spacing w:val="-10"/>
-              </w:rPr>
-              <w:t xml:space="preserve"> </w:t>
-            </w:r>
-            <w:r>
-              <w:rPr>
-                <w:rFonts w:ascii="Arial MT" w:hAnsi="Arial MT"/>
-              </w:rPr>
-              <w:t>Particular;</w:t>
+              <w:t xml:space="preserve">Veículo Particular;</w:t>
             </w:r>
           </w:p>
         </w:tc>
@@ -6024,23 +5058,7 @@
                 <w:sz w:val="26"/>
                 <w:szCs w:val="26"/>
               </w:rPr>
-              <w:t>3</w:t>
-            </w:r>
-            <w:r>
-              <w:rPr>
-                <w:b/>
-                <w:sz w:val="26"/>
-                <w:szCs w:val="26"/>
-              </w:rPr>
-              <w:t xml:space="preserve">. </w:t>
-            </w:r>
-            <w:r>
-              <w:rPr>
-                <w:b/>
-                <w:sz w:val="26"/>
-                <w:szCs w:val="26"/>
-              </w:rPr>
-              <w:t>DADOS PARA HOSPEDAGEM</w:t>
+              <w:t xml:space="preserve">3. DADOS PARA HOSPEDAGEM</w:t>
             </w:r>
           </w:p>
         </w:tc>
@@ -6464,42 +5482,7 @@
                 <w:sz w:val="24"/>
                 <w:szCs w:val="24"/>
               </w:rPr>
-              <w:t>Tipo</w:t>
-            </w:r>
-            <w:r>
-              <w:rPr>
-                <w:b/>
-                <w:spacing w:val="-4"/>
-                <w:sz w:val="24"/>
-                <w:szCs w:val="24"/>
-              </w:rPr>
-              <w:t xml:space="preserve"> </w:t>
-            </w:r>
-            <w:r>
-              <w:rPr>
-                <w:b/>
-                <w:sz w:val="24"/>
-                <w:szCs w:val="24"/>
-              </w:rPr>
-              <w:t>de</w:t>
-            </w:r>
-            <w:r>
-              <w:rPr>
-                <w:b/>
-                <w:spacing w:val="5"/>
-                <w:sz w:val="24"/>
-                <w:szCs w:val="24"/>
-              </w:rPr>
-              <w:t xml:space="preserve"> </w:t>
-            </w:r>
-            <w:r>
-              <w:rPr>
-                <w:b/>
-                <w:spacing w:val="-2"/>
-                <w:sz w:val="24"/>
-                <w:szCs w:val="24"/>
-              </w:rPr>
-              <w:t>transporte terrestre:</w:t>
+              <w:t xml:space="preserve">Tipo de transporte terrestre:</w:t>
             </w:r>
           </w:p>
         </w:tc>
@@ -6561,41 +5544,7 @@
                 <w:sz w:val="24"/>
                 <w:szCs w:val="24"/>
               </w:rPr>
-              <w:t xml:space="preserve">                            Valor</w:t>
-            </w:r>
-            <w:r>
-              <w:rPr>
-                <w:b/>
-                <w:spacing w:val="-7"/>
-                <w:sz w:val="24"/>
-                <w:szCs w:val="24"/>
-              </w:rPr>
-              <w:t xml:space="preserve"> </w:t>
-            </w:r>
-            <w:r>
-              <w:rPr>
-                <w:b/>
-                <w:sz w:val="24"/>
-                <w:szCs w:val="24"/>
-              </w:rPr>
-              <w:t>total</w:t>
-            </w:r>
-            <w:r>
-              <w:rPr>
-                <w:b/>
-                <w:spacing w:val="-5"/>
-                <w:sz w:val="24"/>
-                <w:szCs w:val="24"/>
-              </w:rPr>
-              <w:t xml:space="preserve"> </w:t>
-            </w:r>
-            <w:r>
-              <w:rPr>
-                <w:b/>
-                <w:sz w:val="24"/>
-                <w:szCs w:val="24"/>
-              </w:rPr>
-              <w:t>da</w:t>
+              <w:t xml:space="preserve">                            Valor total da</w:t>
             </w:r>
           </w:p>
           <w:p>
@@ -6616,23 +5565,7 @@
                 <w:sz w:val="24"/>
                 <w:szCs w:val="24"/>
               </w:rPr>
-              <w:t xml:space="preserve">                            </w:t>
-            </w:r>
-            <w:r>
-              <w:rPr>
-                <w:b/>
-                <w:sz w:val="24"/>
-                <w:szCs w:val="24"/>
-              </w:rPr>
-              <w:t>hospeda</w:t>
-            </w:r>
-            <w:r>
-              <w:rPr>
-                <w:b/>
-                <w:sz w:val="24"/>
-                <w:szCs w:val="24"/>
-              </w:rPr>
-              <w:t>gem</w:t>
+              <w:t xml:space="preserve">                            hospedagem</w:t>
             </w:r>
           </w:p>
         </w:tc>
@@ -6785,15 +5718,7 @@
                 <w:sz w:val="26"/>
                 <w:szCs w:val="26"/>
               </w:rPr>
-              <w:t xml:space="preserve">R$ </w:t>
-            </w:r>
-            <w:r>
-              <w:rPr>
-                <w:b/>
-                <w:sz w:val="26"/>
-                <w:szCs w:val="26"/>
-              </w:rPr>
-              <w:t>-</w:t>
+              <w:t xml:space="preserve">{total_hospedagem}</w:t>
             </w:r>
           </w:p>
         </w:tc>
@@ -6853,13 +5778,7 @@
               <w:rPr>
                 <w:rFonts w:ascii="Arial MT" w:hAnsi="Arial MT"/>
               </w:rPr>
-              <w:t xml:space="preserve"> Almoço</w:t>
-            </w:r>
-            <w:r>
-              <w:rPr>
-                <w:rFonts w:ascii="Arial MT" w:hAnsi="Arial MT"/>
-              </w:rPr>
-              <w:t>;</w:t>
+              <w:t xml:space="preserve"> Almoço;</w:t>
             </w:r>
           </w:p>
         </w:tc>
@@ -6993,13 +5912,7 @@
               <w:rPr>
                 <w:rFonts w:ascii="Arial MT" w:hAnsi="Arial MT"/>
               </w:rPr>
-              <w:t xml:space="preserve"> Pensão completa</w:t>
-            </w:r>
-            <w:r>
-              <w:rPr>
-                <w:rFonts w:ascii="Arial MT" w:hAnsi="Arial MT"/>
-              </w:rPr>
-              <w:t>.</w:t>
+              <w:t xml:space="preserve"> Pensão completa.</w:t>
             </w:r>
           </w:p>
         </w:tc>
@@ -7242,15 +6155,7 @@
                 <w:sz w:val="26"/>
                 <w:szCs w:val="26"/>
               </w:rPr>
-              <w:t xml:space="preserve">4. </w:t>
-            </w:r>
-            <w:r>
-              <w:rPr>
-                <w:b/>
-                <w:sz w:val="26"/>
-                <w:szCs w:val="26"/>
-              </w:rPr>
-              <w:t>DESCRIÇÃO DAS DESPESAS PREVISTAS</w:t>
+              <w:t xml:space="preserve">4. DESCRIÇÃO DAS DESPESAS PREVISTAS</w:t>
             </w:r>
           </w:p>
           <w:p>
@@ -7367,13 +6272,6 @@
               <w:t>Descrição</w:t>
             </w:r>
             <w:proofErr w:type="spellEnd"/>
-            <w:r>
-              <w:rPr>
-                <w:rStyle w:val="Refdenotaderodap"/>
-                <w:rFonts w:ascii="Arial" w:eastAsia="Arial" w:hAnsi="Arial"/>
-              </w:rPr>
-              <w:footnoteReference w:id="1"/>
-            </w:r>
           </w:p>
         </w:tc>
         <w:tc>
@@ -7403,17 +6301,9 @@
                 <w:b/>
                 <w:bCs/>
               </w:rPr>
-              <w:t xml:space="preserve">Valor </w:t>
+              <w:t xml:space="preserve">Valor Unitário</w:t>
             </w:r>
             <w:proofErr w:type="spellStart"/>
-            <w:r>
-              <w:rPr>
-                <w:rFonts w:ascii="Arial" w:eastAsia="Arial" w:hAnsi="Arial"/>
-                <w:b/>
-                <w:bCs/>
-              </w:rPr>
-              <w:t>Unitário</w:t>
-            </w:r>
             <w:proofErr w:type="spellEnd"/>
           </w:p>
         </w:tc>
@@ -7546,18 +6436,9 @@
                 <w:szCs w:val="22"/>
                 <w:lang w:val="pt-BR"/>
               </w:rPr>
-              <w:t>Diária</w:t>
+              <w:t xml:space="preserve">Diária(s) Internacional</w:t>
             </w:r>
             <w:proofErr w:type="spellEnd"/>
-            <w:r>
-              <w:rPr>
-                <w:rFonts w:ascii="Arial" w:eastAsia="Arial" w:hAnsi="Arial"/>
-                <w:sz w:val="22"/>
-                <w:szCs w:val="22"/>
-                <w:lang w:val="pt-BR"/>
-              </w:rPr>
-              <w:t>(s) Internacional</w:t>
-            </w:r>
           </w:p>
         </w:tc>
         <w:tc>
@@ -7619,7 +6500,7 @@
                 <w:sz w:val="22"/>
                 <w:szCs w:val="22"/>
               </w:rPr>
-              <w:t>{valor_calc}</w:t>
+              <w:t>{val_diaria_intl}</w:t>
             </w:r>
           </w:p>
         </w:tc>
@@ -7720,28 +6601,10 @@
                 <w:szCs w:val="22"/>
                 <w:lang w:val="pt-BR"/>
               </w:rPr>
-              <w:t xml:space="preserve">Meia </w:t>
+              <w:t xml:space="preserve">Meia Diária(s) Internacional</w:t>
             </w:r>
             <w:proofErr w:type="spellStart"/>
-            <w:r>
-              <w:rPr>
-                <w:rFonts w:ascii="Arial" w:eastAsia="Arial" w:hAnsi="Arial"/>
-                <w:sz w:val="22"/>
-                <w:szCs w:val="22"/>
-                <w:lang w:val="pt-BR"/>
-              </w:rPr>
-              <w:t>Diária</w:t>
-            </w:r>
             <w:proofErr w:type="spellEnd"/>
-            <w:r>
-              <w:rPr>
-                <w:rFonts w:ascii="Arial" w:eastAsia="Arial" w:hAnsi="Arial"/>
-                <w:sz w:val="22"/>
-                <w:szCs w:val="22"/>
-                <w:lang w:val="pt-BR"/>
-              </w:rPr>
-              <w:t>(s) Internacional</w:t>
-            </w:r>
           </w:p>
         </w:tc>
         <w:tc>
@@ -7803,7 +6666,7 @@
                 <w:sz w:val="22"/>
                 <w:szCs w:val="22"/>
               </w:rPr>
-              <w:t>{valor_calc}</w:t>
+              <w:t>{val_meia_diaria_intl}</w:t>
             </w:r>
           </w:p>
         </w:tc>
@@ -7905,18 +6768,9 @@
                 <w:szCs w:val="22"/>
                 <w:lang w:val="pt-BR"/>
               </w:rPr>
-              <w:t>Diária</w:t>
+              <w:t xml:space="preserve">Diária(s) Capital</w:t>
             </w:r>
             <w:proofErr w:type="spellEnd"/>
-            <w:r>
-              <w:rPr>
-                <w:rFonts w:ascii="Arial" w:eastAsia="Arial" w:hAnsi="Arial"/>
-                <w:sz w:val="22"/>
-                <w:szCs w:val="22"/>
-                <w:lang w:val="pt-BR"/>
-              </w:rPr>
-              <w:t>(s) Capital</w:t>
-            </w:r>
           </w:p>
         </w:tc>
         <w:tc>
@@ -7978,7 +6832,7 @@
                 <w:sz w:val="22"/>
                 <w:szCs w:val="22"/>
               </w:rPr>
-              <w:t>R$ 000,00</w:t>
+              <w:t>{val_diaria_capital}</w:t>
             </w:r>
           </w:p>
         </w:tc>
@@ -8079,28 +6933,10 @@
                 <w:szCs w:val="22"/>
                 <w:lang w:val="pt-BR"/>
               </w:rPr>
-              <w:t xml:space="preserve">Meia </w:t>
+              <w:t xml:space="preserve">Meia Diária(s) Capital</w:t>
             </w:r>
             <w:proofErr w:type="spellStart"/>
-            <w:r>
-              <w:rPr>
-                <w:rFonts w:ascii="Arial" w:eastAsia="Arial" w:hAnsi="Arial"/>
-                <w:sz w:val="22"/>
-                <w:szCs w:val="22"/>
-                <w:lang w:val="pt-BR"/>
-              </w:rPr>
-              <w:t>Diária</w:t>
-            </w:r>
             <w:proofErr w:type="spellEnd"/>
-            <w:r>
-              <w:rPr>
-                <w:rFonts w:ascii="Arial" w:eastAsia="Arial" w:hAnsi="Arial"/>
-                <w:sz w:val="22"/>
-                <w:szCs w:val="22"/>
-                <w:lang w:val="pt-BR"/>
-              </w:rPr>
-              <w:t>(s) Capital</w:t>
-            </w:r>
           </w:p>
         </w:tc>
         <w:tc>
@@ -8162,7 +6998,7 @@
                 <w:sz w:val="22"/>
                 <w:szCs w:val="22"/>
               </w:rPr>
-              <w:t>R$ 000,00</w:t>
+              <w:t>{val_meia_diaria_capital}</w:t>
             </w:r>
           </w:p>
         </w:tc>
@@ -8264,18 +7100,9 @@
                 <w:szCs w:val="22"/>
                 <w:lang w:val="pt-BR"/>
               </w:rPr>
-              <w:t>Diária</w:t>
+              <w:t xml:space="preserve">Diária(s) Cidade</w:t>
             </w:r>
             <w:proofErr w:type="spellEnd"/>
-            <w:r>
-              <w:rPr>
-                <w:rFonts w:ascii="Arial" w:eastAsia="Arial" w:hAnsi="Arial"/>
-                <w:sz w:val="22"/>
-                <w:szCs w:val="22"/>
-                <w:lang w:val="pt-BR"/>
-              </w:rPr>
-              <w:t>(s) Cidade</w:t>
-            </w:r>
           </w:p>
         </w:tc>
         <w:tc>
@@ -8337,7 +7164,7 @@
                 <w:sz w:val="22"/>
                 <w:szCs w:val="22"/>
               </w:rPr>
-              <w:t>R$ 000,00</w:t>
+              <w:t>{val_diaria_cidade}</w:t>
             </w:r>
           </w:p>
         </w:tc>
@@ -8438,28 +7265,10 @@
                 <w:szCs w:val="22"/>
                 <w:lang w:val="pt-BR"/>
               </w:rPr>
-              <w:t xml:space="preserve">Meia </w:t>
+              <w:t xml:space="preserve">Meia Diária(s) Cidade</w:t>
             </w:r>
             <w:proofErr w:type="spellStart"/>
-            <w:r>
-              <w:rPr>
-                <w:rFonts w:ascii="Arial" w:eastAsia="Arial" w:hAnsi="Arial"/>
-                <w:sz w:val="22"/>
-                <w:szCs w:val="22"/>
-                <w:lang w:val="pt-BR"/>
-              </w:rPr>
-              <w:t>Diária</w:t>
-            </w:r>
             <w:proofErr w:type="spellEnd"/>
-            <w:r>
-              <w:rPr>
-                <w:rFonts w:ascii="Arial" w:eastAsia="Arial" w:hAnsi="Arial"/>
-                <w:sz w:val="22"/>
-                <w:szCs w:val="22"/>
-                <w:lang w:val="pt-BR"/>
-              </w:rPr>
-              <w:t>(s) Cidade</w:t>
-            </w:r>
           </w:p>
         </w:tc>
         <w:tc>
@@ -8521,7 +7330,7 @@
                 <w:sz w:val="22"/>
                 <w:szCs w:val="22"/>
               </w:rPr>
-              <w:t>R$ 000,00</w:t>
+              <w:t>{val_meia_diaria_cidade}</w:t>
             </w:r>
           </w:p>
         </w:tc>
@@ -8623,18 +7432,9 @@
                 <w:szCs w:val="22"/>
                 <w:lang w:val="pt-BR"/>
               </w:rPr>
-              <w:t>Diária</w:t>
+              <w:t xml:space="preserve">Diária(s) de Campo</w:t>
             </w:r>
             <w:proofErr w:type="spellEnd"/>
-            <w:r>
-              <w:rPr>
-                <w:rFonts w:ascii="Arial" w:eastAsia="Arial" w:hAnsi="Arial"/>
-                <w:sz w:val="22"/>
-                <w:szCs w:val="22"/>
-                <w:lang w:val="pt-BR"/>
-              </w:rPr>
-              <w:t>(s) de Campo</w:t>
-            </w:r>
           </w:p>
         </w:tc>
         <w:tc>
@@ -8696,7 +7496,7 @@
                 <w:sz w:val="22"/>
                 <w:szCs w:val="22"/>
               </w:rPr>
-              <w:t>R$ 000,00</w:t>
+              <w:t>{val_diaria_campo}</w:t>
             </w:r>
           </w:p>
         </w:tc>
@@ -8797,28 +7597,10 @@
                 <w:szCs w:val="22"/>
                 <w:lang w:val="pt-BR"/>
               </w:rPr>
-              <w:t xml:space="preserve">Meia </w:t>
+              <w:t xml:space="preserve">Meia Diária(s) de Campo</w:t>
             </w:r>
             <w:proofErr w:type="spellStart"/>
-            <w:r>
-              <w:rPr>
-                <w:rFonts w:ascii="Arial" w:eastAsia="Arial" w:hAnsi="Arial"/>
-                <w:sz w:val="22"/>
-                <w:szCs w:val="22"/>
-                <w:lang w:val="pt-BR"/>
-              </w:rPr>
-              <w:t>Diária</w:t>
-            </w:r>
             <w:proofErr w:type="spellEnd"/>
-            <w:r>
-              <w:rPr>
-                <w:rFonts w:ascii="Arial" w:eastAsia="Arial" w:hAnsi="Arial"/>
-                <w:sz w:val="22"/>
-                <w:szCs w:val="22"/>
-                <w:lang w:val="pt-BR"/>
-              </w:rPr>
-              <w:t>(s) de Campo</w:t>
-            </w:r>
           </w:p>
         </w:tc>
         <w:tc>
@@ -8880,7 +7662,7 @@
                 <w:sz w:val="22"/>
                 <w:szCs w:val="22"/>
               </w:rPr>
-              <w:t>R$ 000,00</w:t>
+              <w:t>{val_meia_diaria_campo}</w:t>
             </w:r>
           </w:p>
         </w:tc>
@@ -8981,92 +7763,74 @@
                 <w:szCs w:val="22"/>
                 <w:lang w:val="pt-BR"/>
               </w:rPr>
-              <w:t xml:space="preserve">Meia </w:t>
+              <w:t xml:space="preserve">Meia Diária(s) de Deslocamento</w:t>
             </w:r>
             <w:proofErr w:type="spellStart"/>
-            <w:r>
+            <w:proofErr w:type="spellEnd"/>
+          </w:p>
+        </w:tc>
+        <w:tc>
+          <w:tcPr>
+            <w:tcW w:w="1418" w:type="dxa"/>
+            <w:tcBorders>
+              <w:top w:val="single" w:sz="2" w:space="0" w:color="000000"/>
+              <w:left w:val="single" w:sz="4" w:space="0" w:color="000000"/>
+              <w:bottom w:val="single" w:sz="2" w:space="0" w:color="000000"/>
+              <w:right w:val="single" w:sz="4" w:space="0" w:color="000000"/>
+            </w:tcBorders>
+          </w:tcPr>
+          <w:p>
+            <w:pPr>
+              <w:spacing w:before="104"/>
+              <w:ind w:left="5" w:right="112"/>
+              <w:jc w:val="center"/>
               <w:rPr>
                 <w:rFonts w:ascii="Arial" w:eastAsia="Arial" w:hAnsi="Arial"/>
                 <w:sz w:val="22"/>
                 <w:szCs w:val="22"/>
                 <w:lang w:val="pt-BR"/>
               </w:rPr>
-              <w:t>Diária</w:t>
-            </w:r>
-            <w:proofErr w:type="spellEnd"/>
-            <w:r>
+            </w:pPr>
+            <w:r>
+              <w:rPr>
+                <w:rFonts w:ascii="Arial" w:eastAsia="Arial" w:hAnsi="Arial"/>
+                <w:sz w:val="22"/>
+                <w:szCs w:val="22"/>
+              </w:rPr>
+              <w:t>R$ 225,00</w:t>
+            </w:r>
+          </w:p>
+        </w:tc>
+        <w:tc>
+          <w:tcPr>
+            <w:tcW w:w="1417" w:type="dxa"/>
+            <w:tcBorders>
+              <w:top w:val="single" w:sz="4" w:space="0" w:color="000000"/>
+              <w:left w:val="single" w:sz="4" w:space="0" w:color="000000"/>
+              <w:bottom w:val="single" w:sz="4" w:space="0" w:color="000000"/>
+              <w:right w:val="nil"/>
+            </w:tcBorders>
+            <w:shd w:val="clear" w:color="auto" w:fill="E2EFD9" w:themeFill="accent6" w:themeFillTint="33"/>
+          </w:tcPr>
+          <w:p>
+            <w:pPr>
+              <w:spacing w:before="104"/>
+              <w:ind w:right="140"/>
+              <w:jc w:val="center"/>
               <w:rPr>
                 <w:rFonts w:ascii="Arial" w:eastAsia="Arial" w:hAnsi="Arial"/>
                 <w:sz w:val="22"/>
                 <w:szCs w:val="22"/>
                 <w:lang w:val="pt-BR"/>
               </w:rPr>
-              <w:t>(s) de Deslocamento</w:t>
-            </w:r>
-          </w:p>
-        </w:tc>
-        <w:tc>
-          <w:tcPr>
-            <w:tcW w:w="1418" w:type="dxa"/>
-            <w:tcBorders>
-              <w:top w:val="single" w:sz="2" w:space="0" w:color="000000"/>
-              <w:left w:val="single" w:sz="4" w:space="0" w:color="000000"/>
-              <w:bottom w:val="single" w:sz="2" w:space="0" w:color="000000"/>
-              <w:right w:val="single" w:sz="4" w:space="0" w:color="000000"/>
-            </w:tcBorders>
-          </w:tcPr>
-          <w:p>
-            <w:pPr>
-              <w:spacing w:before="104"/>
-              <w:ind w:left="5" w:right="112"/>
-              <w:jc w:val="center"/>
+            </w:pPr>
+            <w:r>
               <w:rPr>
                 <w:rFonts w:ascii="Arial" w:eastAsia="Arial" w:hAnsi="Arial"/>
                 <w:sz w:val="22"/>
                 <w:szCs w:val="22"/>
-                <w:lang w:val="pt-BR"/>
-              </w:rPr>
-            </w:pPr>
-            <w:r>
-              <w:rPr>
-                <w:rFonts w:ascii="Arial" w:eastAsia="Arial" w:hAnsi="Arial"/>
-                <w:sz w:val="22"/>
-                <w:szCs w:val="22"/>
-              </w:rPr>
-              <w:t>R$ 225,00</w:t>
-            </w:r>
-          </w:p>
-        </w:tc>
-        <w:tc>
-          <w:tcPr>
-            <w:tcW w:w="1417" w:type="dxa"/>
-            <w:tcBorders>
-              <w:top w:val="single" w:sz="4" w:space="0" w:color="000000"/>
-              <w:left w:val="single" w:sz="4" w:space="0" w:color="000000"/>
-              <w:bottom w:val="single" w:sz="4" w:space="0" w:color="000000"/>
-              <w:right w:val="nil"/>
-            </w:tcBorders>
-            <w:shd w:val="clear" w:color="auto" w:fill="E2EFD9" w:themeFill="accent6" w:themeFillTint="33"/>
-          </w:tcPr>
-          <w:p>
-            <w:pPr>
-              <w:spacing w:before="104"/>
-              <w:ind w:right="140"/>
-              <w:jc w:val="center"/>
-              <w:rPr>
-                <w:rFonts w:ascii="Arial" w:eastAsia="Arial" w:hAnsi="Arial"/>
-                <w:sz w:val="22"/>
-                <w:szCs w:val="22"/>
-                <w:lang w:val="pt-BR"/>
-              </w:rPr>
-            </w:pPr>
-            <w:r>
-              <w:rPr>
-                <w:rFonts w:ascii="Arial" w:eastAsia="Arial" w:hAnsi="Arial"/>
-                <w:sz w:val="22"/>
-                <w:szCs w:val="22"/>
-              </w:rPr>
-              <w:t>R$ 000,00</w:t>
+              </w:rPr>
+              <w:t>{val_meia_diaria_deslocamento}</w:t>
             </w:r>
           </w:p>
         </w:tc>
@@ -9166,16 +7930,7 @@
                 <w:szCs w:val="22"/>
                 <w:lang w:val="pt-BR"/>
               </w:rPr>
-              <w:t xml:space="preserve">Meia </w:t>
-            </w:r>
-            <w:r>
-              <w:rPr>
-                <w:rFonts w:ascii="Arial" w:eastAsia="Arial" w:hAnsi="Arial"/>
-                <w:sz w:val="22"/>
-                <w:szCs w:val="22"/>
-                <w:lang w:val="pt-BR"/>
-              </w:rPr>
-              <w:t xml:space="preserve">Viagem sem Pernoite </w:t>
+              <w:t xml:space="preserve">Meia Viagem sem Pernoite </w:t>
             </w:r>
           </w:p>
         </w:tc>
@@ -9238,7 +7993,7 @@
                 <w:sz w:val="22"/>
                 <w:szCs w:val="22"/>
               </w:rPr>
-              <w:t>R$ 000,00</w:t>
+              <w:t>{val_meia_viagem}</w:t>
             </w:r>
           </w:p>
         </w:tc>
@@ -9341,57 +8096,7 @@
                 <w:sz w:val="22"/>
                 <w:szCs w:val="22"/>
               </w:rPr>
-              <w:t>R</w:t>
-            </w:r>
-            <w:r>
-              <w:rPr>
-                <w:rFonts w:ascii="Arial" w:eastAsia="Arial" w:hAnsi="Arial"/>
-                <w:b/>
-                <w:bCs/>
-                <w:sz w:val="22"/>
-                <w:szCs w:val="22"/>
-              </w:rPr>
-              <w:t xml:space="preserve">$ </w:t>
-            </w:r>
-            <w:r>
-              <w:rPr>
-                <w:rFonts w:ascii="Arial" w:eastAsia="Arial" w:hAnsi="Arial"/>
-                <w:b/>
-                <w:bCs/>
-                <w:sz w:val="22"/>
-                <w:szCs w:val="22"/>
-              </w:rPr>
-              <w:t>0</w:t>
-            </w:r>
-            <w:r>
-              <w:rPr>
-                <w:rFonts w:ascii="Arial" w:eastAsia="Arial" w:hAnsi="Arial"/>
-                <w:b/>
-                <w:bCs/>
-                <w:sz w:val="22"/>
-                <w:szCs w:val="22"/>
-              </w:rPr>
-              <w:t>.</w:t>
-            </w:r>
-            <w:r>
-              <w:rPr>
-                <w:rFonts w:ascii="Arial" w:eastAsia="Arial" w:hAnsi="Arial"/>
-                <w:b/>
-                <w:bCs/>
-                <w:sz w:val="22"/>
-                <w:szCs w:val="22"/>
-              </w:rPr>
-              <w:t>000</w:t>
-            </w:r>
-            <w:r>
-              <w:rPr>
-                <w:rFonts w:ascii="Arial" w:eastAsia="Arial" w:hAnsi="Arial"/>
-                <w:b/>
-                <w:bCs/>
-                <w:sz w:val="22"/>
-                <w:szCs w:val="22"/>
-              </w:rPr>
-              <w:t>,00</w:t>
+              <w:t xml:space="preserve">{total_geral}</w:t>
             </w:r>
           </w:p>
           <w:p>
@@ -9439,23 +8144,7 @@
                 <w:b/>
                 <w:lang w:val="pt-BR"/>
               </w:rPr>
-              <w:t xml:space="preserve">Valor Total </w:t>
-            </w:r>
-            <w:r>
-              <w:rPr>
-                <w:rFonts w:ascii="Arial" w:hAnsi="Arial" w:cs="Arial"/>
-                <w:b/>
-                <w:lang w:val="pt-BR"/>
-              </w:rPr>
-              <w:t xml:space="preserve">(1 + 2 + 3 + 4) </w:t>
-            </w:r>
-            <w:r>
-              <w:rPr>
-                <w:rFonts w:ascii="Arial" w:hAnsi="Arial" w:cs="Arial"/>
-                <w:b/>
-                <w:lang w:val="pt-BR"/>
-              </w:rPr>
-              <w:t>a ser creditado na conta em reais</w:t>
+              <w:t xml:space="preserve">Valor Total (1 + 2 + 3 + 4) a ser creditado na conta em reais</w:t>
             </w:r>
           </w:p>
         </w:tc>
@@ -9611,74 +8300,6 @@
         <w:rPr>
           <w:noProof/>
         </w:rPr>
-        <mc:AlternateContent>
-          <mc:Choice Requires="wps">
-            <w:drawing>
-              <wp:anchor distT="0" distB="0" distL="0" distR="0" simplePos="0" relativeHeight="251663360" behindDoc="1" locked="0" layoutInCell="1" allowOverlap="1" wp14:anchorId="0DAF0937" wp14:editId="21C80845">
-                <wp:simplePos x="0" y="0"/>
-                <wp:positionH relativeFrom="page">
-                  <wp:posOffset>713740</wp:posOffset>
-                </wp:positionH>
-                <wp:positionV relativeFrom="paragraph">
-                  <wp:posOffset>211455</wp:posOffset>
-                </wp:positionV>
-                <wp:extent cx="6193790" cy="45085"/>
-                <wp:effectExtent l="0" t="0" r="3810" b="5715"/>
-                <wp:wrapTopAndBottom/>
-                <wp:docPr id="11" name="Retângulo 11"/>
-                <wp:cNvGraphicFramePr>
-                  <a:graphicFrameLocks xmlns:a="http://schemas.openxmlformats.org/drawingml/2006/main"/>
-                </wp:cNvGraphicFramePr>
-                <a:graphic xmlns:a="http://schemas.openxmlformats.org/drawingml/2006/main">
-                  <a:graphicData uri="http://schemas.microsoft.com/office/word/2010/wordprocessingShape">
-                    <wps:wsp>
-                      <wps:cNvSpPr>
-                        <a:spLocks/>
-                      </wps:cNvSpPr>
-                      <wps:spPr bwMode="auto">
-                        <a:xfrm>
-                          <a:off x="0" y="0"/>
-                          <a:ext cx="6193790" cy="45085"/>
-                        </a:xfrm>
-                        <a:prstGeom prst="rect">
-                          <a:avLst/>
-                        </a:prstGeom>
-                        <a:solidFill>
-                          <a:srgbClr val="000000"/>
-                        </a:solidFill>
-                        <a:ln>
-                          <a:noFill/>
-                        </a:ln>
-                      </wps:spPr>
-                      <wps:bodyPr rot="0" vert="horz" wrap="square" lIns="91440" tIns="45720" rIns="91440" bIns="45720" anchor="t" anchorCtr="0" upright="1">
-                        <a:noAutofit/>
-                      </wps:bodyPr>
-                    </wps:wsp>
-                  </a:graphicData>
-                </a:graphic>
-                <wp14:sizeRelH relativeFrom="page">
-                  <wp14:pctWidth>0</wp14:pctWidth>
-                </wp14:sizeRelH>
-                <wp14:sizeRelV relativeFrom="page">
-                  <wp14:pctHeight>0</wp14:pctHeight>
-                </wp14:sizeRelV>
-              </wp:anchor>
-            </w:drawing>
-          </mc:Choice>
-          <mc:Fallback>
-            <w:pict>
-              <v:rect w14:anchorId="16FE8374" id="Retângulo 11" o:spid="_x0000_s1026" style="position:absolute;margin-left:56.2pt;margin-top:16.65pt;width:487.7pt;height:3.55pt;z-index:-251653120;visibility:visible;mso-wrap-style:square;mso-width-percent:0;mso-height-percent:0;mso-wrap-distance-left:0;mso-wrap-distance-top:0;mso-wrap-distance-right:0;mso-wrap-distance-bottom:0;mso-position-horizontal:absolute;mso-position-horizontal-relative:page;mso-position-vertical:absolute;mso-position-vertical-relative:text;mso-width-percent:0;mso-height-percent:0;mso-width-relative:page;mso-height-relative:page;v-text-anchor:top" o:gfxdata="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" fillcolor="black" stroked="f">
-                <w10:wrap type="topAndBottom" anchorx="page"/>
-              </v:rect>
-            </w:pict>
-          </mc:Fallback>
-        </mc:AlternateContent>
-      </w:r>
-      <w:r>
-        <w:rPr>
-          <w:rFonts w:ascii="Arial" w:eastAsia="Arial" w:hAnsi="Arial"/>
-          <w:b/>
-        </w:rPr>
         <w:t>Importante</w:t>
       </w:r>
     </w:p>
@@ -9699,332 +8320,34 @@
           <w:sz w:val="22"/>
           <w:szCs w:val="22"/>
         </w:rPr>
-        <w:t xml:space="preserve">Para os casos em que a viagem e/ ou evento ou atividade </w:t>
+        <w:t xml:space="preserve">Para os casos em que a viagem e/ ou evento ou atividade não acontecer (for cancelado) e que o adiantamento já tenha sido realizado ou que houver sobra do montante do recurso adiantado, deve ocorrer a devolução total ou parcial (diferença entre o depositado e o gasto) dos recursos. A devolução, não deve ser feita via PIX, somente será aceito depósito bancário deve ser feita pelo beneficiário em agência do Banco do Brasil (001): Agência 3519- X, Conta Corrente 113.554-6, CNPJ 33.641.663/0001-44, no prazo até 5 (cinco) dias após cancelada ou finalizada a viagem. </w:t>
       </w:r>
       <w:proofErr w:type="spellStart"/>
-      <w:r>
-        <w:rPr>
-          <w:rFonts w:ascii="Arial" w:hAnsi="Arial"/>
-          <w:sz w:val="22"/>
-          <w:szCs w:val="22"/>
-        </w:rPr>
-        <w:t>não</w:t>
-      </w:r>
       <w:proofErr w:type="spellEnd"/>
-      <w:r>
-        <w:rPr>
-          <w:rFonts w:ascii="Arial" w:hAnsi="Arial"/>
-          <w:sz w:val="22"/>
-          <w:szCs w:val="22"/>
-        </w:rPr>
-        <w:t xml:space="preserve"> acontecer (for cancelado) e que o adiantamento </w:t>
-      </w:r>
       <w:proofErr w:type="spellStart"/>
-      <w:r>
-        <w:rPr>
-          <w:rFonts w:ascii="Arial" w:hAnsi="Arial"/>
-          <w:sz w:val="22"/>
-          <w:szCs w:val="22"/>
-        </w:rPr>
-        <w:t>ja</w:t>
-      </w:r>
       <w:proofErr w:type="spellEnd"/>
-      <w:r>
-        <w:rPr>
-          <w:rFonts w:ascii="Arial" w:hAnsi="Arial"/>
-          <w:sz w:val="22"/>
-          <w:szCs w:val="22"/>
-        </w:rPr>
-        <w:t xml:space="preserve">́ tenha sido realizado ou que houver sobra do montante do recurso adiantado, deve ocorrer a </w:t>
-      </w:r>
       <w:proofErr w:type="spellStart"/>
-      <w:r>
-        <w:rPr>
-          <w:rFonts w:ascii="Arial" w:hAnsi="Arial"/>
-          <w:sz w:val="22"/>
-          <w:szCs w:val="22"/>
-        </w:rPr>
-        <w:t>devolução</w:t>
-      </w:r>
       <w:proofErr w:type="spellEnd"/>
-      <w:r>
-        <w:rPr>
-          <w:rFonts w:ascii="Arial" w:hAnsi="Arial"/>
-          <w:sz w:val="22"/>
-          <w:szCs w:val="22"/>
-        </w:rPr>
-        <w:t xml:space="preserve"> total ou parcial (</w:t>
-      </w:r>
       <w:proofErr w:type="spellStart"/>
-      <w:r>
-        <w:rPr>
-          <w:rFonts w:ascii="Arial" w:hAnsi="Arial"/>
-          <w:sz w:val="22"/>
-          <w:szCs w:val="22"/>
-        </w:rPr>
-        <w:t>diferença</w:t>
-      </w:r>
       <w:proofErr w:type="spellEnd"/>
-      <w:r>
-        <w:rPr>
-          <w:rFonts w:ascii="Arial" w:hAnsi="Arial"/>
-          <w:sz w:val="22"/>
-          <w:szCs w:val="22"/>
-        </w:rPr>
-        <w:t xml:space="preserve"> entre o depositado e o gasto) dos recursos. A </w:t>
-      </w:r>
       <w:proofErr w:type="spellStart"/>
-      <w:r>
-        <w:rPr>
-          <w:rFonts w:ascii="Arial" w:hAnsi="Arial"/>
-          <w:sz w:val="22"/>
-          <w:szCs w:val="22"/>
-        </w:rPr>
-        <w:t>devolução</w:t>
-      </w:r>
       <w:proofErr w:type="spellEnd"/>
-      <w:r>
-        <w:rPr>
-          <w:rFonts w:ascii="Arial" w:hAnsi="Arial"/>
-          <w:sz w:val="22"/>
-          <w:szCs w:val="22"/>
-        </w:rPr>
-        <w:t xml:space="preserve">, </w:t>
-      </w:r>
       <w:proofErr w:type="spellStart"/>
-      <w:r>
-        <w:rPr>
-          <w:rFonts w:ascii="Arial" w:hAnsi="Arial"/>
-          <w:b/>
-          <w:bCs/>
-          <w:color w:val="FF0000"/>
-          <w:sz w:val="22"/>
-          <w:szCs w:val="22"/>
-        </w:rPr>
-        <w:t>não</w:t>
-      </w:r>
       <w:proofErr w:type="spellEnd"/>
-      <w:r>
-        <w:rPr>
-          <w:rFonts w:ascii="Arial" w:hAnsi="Arial"/>
-          <w:b/>
-          <w:bCs/>
-          <w:color w:val="FF0000"/>
-          <w:sz w:val="22"/>
-          <w:szCs w:val="22"/>
-        </w:rPr>
-        <w:t xml:space="preserve"> deve ser feita via PIX</w:t>
-      </w:r>
-      <w:r>
-        <w:rPr>
-          <w:rFonts w:ascii="Arial" w:hAnsi="Arial"/>
-          <w:sz w:val="22"/>
-          <w:szCs w:val="22"/>
-        </w:rPr>
-        <w:t xml:space="preserve">, somente </w:t>
-      </w:r>
       <w:proofErr w:type="spellStart"/>
-      <w:r>
-        <w:rPr>
-          <w:rFonts w:ascii="Arial" w:hAnsi="Arial"/>
-          <w:b/>
-          <w:bCs/>
-          <w:sz w:val="22"/>
-          <w:szCs w:val="22"/>
-        </w:rPr>
-        <w:t>sera</w:t>
-      </w:r>
       <w:proofErr w:type="spellEnd"/>
-      <w:r>
-        <w:rPr>
-          <w:rFonts w:ascii="Arial" w:hAnsi="Arial"/>
-          <w:b/>
-          <w:bCs/>
-          <w:sz w:val="22"/>
-          <w:szCs w:val="22"/>
-        </w:rPr>
-        <w:t>́ aceito</w:t>
-      </w:r>
-      <w:r>
-        <w:rPr>
-          <w:rFonts w:ascii="Arial" w:hAnsi="Arial"/>
-          <w:b/>
-          <w:bCs/>
-          <w:sz w:val="22"/>
-          <w:szCs w:val="22"/>
-        </w:rPr>
-        <w:t xml:space="preserve"> </w:t>
-      </w:r>
       <w:proofErr w:type="spellStart"/>
-      <w:r>
-        <w:rPr>
-          <w:rFonts w:ascii="Arial" w:hAnsi="Arial"/>
-          <w:b/>
-          <w:bCs/>
-          <w:sz w:val="22"/>
-          <w:szCs w:val="22"/>
-        </w:rPr>
-        <w:t>depósito</w:t>
-      </w:r>
       <w:proofErr w:type="spellEnd"/>
-      <w:r>
-        <w:rPr>
-          <w:rFonts w:ascii="Arial" w:hAnsi="Arial"/>
-          <w:b/>
-          <w:bCs/>
-          <w:sz w:val="22"/>
-          <w:szCs w:val="22"/>
-        </w:rPr>
-        <w:t xml:space="preserve"> </w:t>
-      </w:r>
       <w:proofErr w:type="spellStart"/>
-      <w:r>
-        <w:rPr>
-          <w:rFonts w:ascii="Arial" w:hAnsi="Arial"/>
-          <w:b/>
-          <w:bCs/>
-          <w:sz w:val="22"/>
-          <w:szCs w:val="22"/>
-        </w:rPr>
-        <w:t>bancário</w:t>
-      </w:r>
       <w:proofErr w:type="spellEnd"/>
-      <w:r>
-        <w:rPr>
-          <w:rFonts w:ascii="Arial" w:hAnsi="Arial"/>
-          <w:sz w:val="22"/>
-          <w:szCs w:val="22"/>
-        </w:rPr>
-        <w:t xml:space="preserve"> deve ser feita pelo </w:t>
-      </w:r>
       <w:proofErr w:type="spellStart"/>
-      <w:r>
-        <w:rPr>
-          <w:rFonts w:ascii="Arial" w:hAnsi="Arial"/>
-          <w:sz w:val="22"/>
-          <w:szCs w:val="22"/>
-        </w:rPr>
-        <w:t>beneficiário</w:t>
-      </w:r>
       <w:proofErr w:type="spellEnd"/>
-      <w:r>
-        <w:rPr>
-          <w:rFonts w:ascii="Arial" w:hAnsi="Arial"/>
-          <w:sz w:val="22"/>
-          <w:szCs w:val="22"/>
-        </w:rPr>
-        <w:t xml:space="preserve"> em </w:t>
-      </w:r>
       <w:proofErr w:type="spellStart"/>
-      <w:r>
-        <w:rPr>
-          <w:rFonts w:ascii="Arial" w:hAnsi="Arial"/>
-          <w:sz w:val="22"/>
-          <w:szCs w:val="22"/>
-        </w:rPr>
-        <w:t>agência</w:t>
-      </w:r>
       <w:proofErr w:type="spellEnd"/>
-      <w:r>
-        <w:rPr>
-          <w:rFonts w:ascii="Arial" w:hAnsi="Arial"/>
-          <w:sz w:val="22"/>
-          <w:szCs w:val="22"/>
-        </w:rPr>
-        <w:t xml:space="preserve"> do Banco do Brasil (001): </w:t>
-      </w:r>
       <w:proofErr w:type="spellStart"/>
-      <w:r>
-        <w:rPr>
-          <w:rFonts w:ascii="Arial" w:hAnsi="Arial"/>
-          <w:sz w:val="22"/>
-          <w:szCs w:val="22"/>
-        </w:rPr>
-        <w:t>Agência</w:t>
-      </w:r>
       <w:proofErr w:type="spellEnd"/>
-      <w:r>
-        <w:rPr>
-          <w:rFonts w:ascii="Arial" w:hAnsi="Arial"/>
-          <w:sz w:val="22"/>
-          <w:szCs w:val="22"/>
-        </w:rPr>
-        <w:t xml:space="preserve"> 3519- X, Conta Corrente </w:t>
-      </w:r>
-      <w:r>
-        <w:rPr>
-          <w:rFonts w:ascii="Arial" w:hAnsi="Arial"/>
-          <w:sz w:val="22"/>
-          <w:szCs w:val="22"/>
-        </w:rPr>
-        <w:t>11</w:t>
-      </w:r>
-      <w:r>
-        <w:rPr>
-          <w:rFonts w:ascii="Arial" w:hAnsi="Arial"/>
-          <w:sz w:val="22"/>
-          <w:szCs w:val="22"/>
-        </w:rPr>
-        <w:t>3</w:t>
-      </w:r>
-      <w:r>
-        <w:rPr>
-          <w:rFonts w:ascii="Arial" w:hAnsi="Arial"/>
-          <w:sz w:val="22"/>
-          <w:szCs w:val="22"/>
-        </w:rPr>
-        <w:t>.</w:t>
-      </w:r>
-      <w:r>
-        <w:rPr>
-          <w:rFonts w:ascii="Arial" w:hAnsi="Arial"/>
-          <w:sz w:val="22"/>
-          <w:szCs w:val="22"/>
-        </w:rPr>
-        <w:t>554</w:t>
-      </w:r>
-      <w:r>
-        <w:rPr>
-          <w:rFonts w:ascii="Arial" w:hAnsi="Arial"/>
-          <w:sz w:val="22"/>
-          <w:szCs w:val="22"/>
-        </w:rPr>
-        <w:t>-</w:t>
-      </w:r>
-      <w:r>
-        <w:rPr>
-          <w:rFonts w:ascii="Arial" w:hAnsi="Arial"/>
-          <w:sz w:val="22"/>
-          <w:szCs w:val="22"/>
-        </w:rPr>
-        <w:t>6</w:t>
-      </w:r>
-      <w:r>
-        <w:rPr>
-          <w:rFonts w:ascii="Arial" w:hAnsi="Arial"/>
-          <w:sz w:val="22"/>
-          <w:szCs w:val="22"/>
-        </w:rPr>
-        <w:t xml:space="preserve">, CNPJ 33.641.663/0001-44, no prazo até 5 (cinco) dias </w:t>
-      </w:r>
       <w:proofErr w:type="spellStart"/>
-      <w:r>
-        <w:rPr>
-          <w:rFonts w:ascii="Arial" w:hAnsi="Arial"/>
-          <w:sz w:val="22"/>
-          <w:szCs w:val="22"/>
-        </w:rPr>
-        <w:t>após</w:t>
-      </w:r>
       <w:proofErr w:type="spellEnd"/>
-      <w:r>
-        <w:rPr>
-          <w:rFonts w:ascii="Arial" w:hAnsi="Arial"/>
-          <w:sz w:val="22"/>
-          <w:szCs w:val="22"/>
-        </w:rPr>
-        <w:t xml:space="preserve"> cancelada ou finalizada a viagem. </w:t>
-      </w:r>
     </w:p>
     <w:p>
       <w:pPr>
@@ -10043,204 +8366,28 @@
           <w:sz w:val="22"/>
           <w:szCs w:val="22"/>
         </w:rPr>
-        <w:t xml:space="preserve">O comprovante de </w:t>
+        <w:t xml:space="preserve">O comprovante de depósito deve ser encaminhado escaneado, via e-mail para o Ponto Focal da Unidade Operativa, para coordenação regional e o assistente operacional da AEP-FGV. Se a prestação de contas não for efetivada, o beneficiário ficará inadimplente e não poderá viajar, receber diárias ou adiantamento com recursos do projeto, e novos adiantamentos de recursos à Unidade Operativa são bloqueados até que se resolva a pendência. </w:t>
       </w:r>
       <w:proofErr w:type="spellStart"/>
-      <w:r>
-        <w:rPr>
-          <w:rFonts w:ascii="Arial" w:hAnsi="Arial"/>
-          <w:sz w:val="22"/>
-          <w:szCs w:val="22"/>
-        </w:rPr>
-        <w:t>depósito</w:t>
-      </w:r>
       <w:proofErr w:type="spellEnd"/>
-      <w:r>
-        <w:rPr>
-          <w:rFonts w:ascii="Arial" w:hAnsi="Arial"/>
-          <w:sz w:val="22"/>
-          <w:szCs w:val="22"/>
-        </w:rPr>
-        <w:t xml:space="preserve"> deve ser encaminhado escaneado, via e-mail para o Ponto Focal da Unidade Operativa, para </w:t>
-      </w:r>
       <w:proofErr w:type="spellStart"/>
-      <w:r>
-        <w:rPr>
-          <w:rFonts w:ascii="Arial" w:hAnsi="Arial"/>
-          <w:sz w:val="22"/>
-          <w:szCs w:val="22"/>
-        </w:rPr>
-        <w:t>coordenação</w:t>
-      </w:r>
       <w:proofErr w:type="spellEnd"/>
-      <w:r>
-        <w:rPr>
-          <w:rFonts w:ascii="Arial" w:hAnsi="Arial"/>
-          <w:sz w:val="22"/>
-          <w:szCs w:val="22"/>
-        </w:rPr>
-        <w:t xml:space="preserve"> regional e o assistente operacional da </w:t>
-      </w:r>
-      <w:r>
-        <w:rPr>
-          <w:rFonts w:ascii="Arial" w:hAnsi="Arial"/>
-          <w:sz w:val="22"/>
-          <w:szCs w:val="22"/>
-        </w:rPr>
-        <w:t>A</w:t>
-      </w:r>
-      <w:r>
-        <w:rPr>
-          <w:rFonts w:ascii="Arial" w:hAnsi="Arial"/>
-          <w:sz w:val="22"/>
-          <w:szCs w:val="22"/>
-        </w:rPr>
-        <w:t xml:space="preserve">EP-FGV. Se a </w:t>
-      </w:r>
       <w:proofErr w:type="spellStart"/>
-      <w:r>
-        <w:rPr>
-          <w:rFonts w:ascii="Arial" w:hAnsi="Arial"/>
-          <w:sz w:val="22"/>
-          <w:szCs w:val="22"/>
-        </w:rPr>
-        <w:t>prestação</w:t>
-      </w:r>
       <w:proofErr w:type="spellEnd"/>
-      <w:r>
-        <w:rPr>
-          <w:rFonts w:ascii="Arial" w:hAnsi="Arial"/>
-          <w:sz w:val="22"/>
-          <w:szCs w:val="22"/>
-        </w:rPr>
-        <w:t xml:space="preserve"> de contas </w:t>
-      </w:r>
       <w:proofErr w:type="spellStart"/>
-      <w:r>
-        <w:rPr>
-          <w:rFonts w:ascii="Arial" w:hAnsi="Arial"/>
-          <w:sz w:val="22"/>
-          <w:szCs w:val="22"/>
-        </w:rPr>
-        <w:t>não</w:t>
-      </w:r>
       <w:proofErr w:type="spellEnd"/>
-      <w:r>
-        <w:rPr>
-          <w:rFonts w:ascii="Arial" w:hAnsi="Arial"/>
-          <w:sz w:val="22"/>
-          <w:szCs w:val="22"/>
-        </w:rPr>
-        <w:t xml:space="preserve"> for efetivada, o </w:t>
-      </w:r>
       <w:proofErr w:type="spellStart"/>
-      <w:r>
-        <w:rPr>
-          <w:rFonts w:ascii="Arial" w:hAnsi="Arial"/>
-          <w:sz w:val="22"/>
-          <w:szCs w:val="22"/>
-        </w:rPr>
-        <w:t>beneficiário</w:t>
-      </w:r>
       <w:proofErr w:type="spellEnd"/>
-      <w:r>
-        <w:rPr>
-          <w:rFonts w:ascii="Arial" w:hAnsi="Arial"/>
-          <w:sz w:val="22"/>
-          <w:szCs w:val="22"/>
-        </w:rPr>
-        <w:t xml:space="preserve"> ficará inadimplente e </w:t>
-      </w:r>
       <w:proofErr w:type="spellStart"/>
-      <w:r>
-        <w:rPr>
-          <w:rFonts w:ascii="Arial" w:hAnsi="Arial"/>
-          <w:sz w:val="22"/>
-          <w:szCs w:val="22"/>
-        </w:rPr>
-        <w:t>não</w:t>
-      </w:r>
       <w:proofErr w:type="spellEnd"/>
-      <w:r>
-        <w:rPr>
-          <w:rFonts w:ascii="Arial" w:hAnsi="Arial"/>
-          <w:sz w:val="22"/>
-          <w:szCs w:val="22"/>
-        </w:rPr>
-        <w:t xml:space="preserve"> </w:t>
-      </w:r>
       <w:proofErr w:type="spellStart"/>
-      <w:r>
-        <w:rPr>
-          <w:rFonts w:ascii="Arial" w:hAnsi="Arial"/>
-          <w:sz w:val="22"/>
-          <w:szCs w:val="22"/>
-        </w:rPr>
-        <w:t>podera</w:t>
-      </w:r>
       <w:proofErr w:type="spellEnd"/>
-      <w:r>
-        <w:rPr>
-          <w:rFonts w:ascii="Arial" w:hAnsi="Arial"/>
-          <w:sz w:val="22"/>
-          <w:szCs w:val="22"/>
-        </w:rPr>
-        <w:t xml:space="preserve">́ viajar, receber </w:t>
-      </w:r>
       <w:proofErr w:type="spellStart"/>
-      <w:r>
-        <w:rPr>
-          <w:rFonts w:ascii="Arial" w:hAnsi="Arial"/>
-          <w:sz w:val="22"/>
-          <w:szCs w:val="22"/>
-        </w:rPr>
-        <w:t>diárias</w:t>
-      </w:r>
       <w:proofErr w:type="spellEnd"/>
-      <w:r>
-        <w:rPr>
-          <w:rFonts w:ascii="Arial" w:hAnsi="Arial"/>
-          <w:sz w:val="22"/>
-          <w:szCs w:val="22"/>
-        </w:rPr>
-        <w:t xml:space="preserve"> ou adiantamento com recursos do projeto, e novos adiantamentos de recursos à Unidade Operativa </w:t>
-      </w:r>
       <w:proofErr w:type="spellStart"/>
-      <w:r>
-        <w:rPr>
-          <w:rFonts w:ascii="Arial" w:hAnsi="Arial"/>
-          <w:sz w:val="22"/>
-          <w:szCs w:val="22"/>
-        </w:rPr>
-        <w:t>são</w:t>
-      </w:r>
       <w:proofErr w:type="spellEnd"/>
-      <w:r>
-        <w:rPr>
-          <w:rFonts w:ascii="Arial" w:hAnsi="Arial"/>
-          <w:sz w:val="22"/>
-          <w:szCs w:val="22"/>
-        </w:rPr>
-        <w:t xml:space="preserve"> bloqueados até que se resolva a </w:t>
-      </w:r>
       <w:proofErr w:type="spellStart"/>
-      <w:r>
-        <w:rPr>
-          <w:rFonts w:ascii="Arial" w:hAnsi="Arial"/>
-          <w:sz w:val="22"/>
-          <w:szCs w:val="22"/>
-        </w:rPr>
-        <w:t>pendência</w:t>
-      </w:r>
       <w:proofErr w:type="spellEnd"/>
-      <w:r>
-        <w:rPr>
-          <w:rFonts w:ascii="Arial" w:hAnsi="Arial"/>
-          <w:sz w:val="22"/>
-          <w:szCs w:val="22"/>
-        </w:rPr>
-        <w:t xml:space="preserve">. </w:t>
-      </w:r>
     </w:p>
     <w:p>
       <w:pPr>
@@ -10259,55 +8406,7 @@
           <w:sz w:val="22"/>
           <w:szCs w:val="22"/>
         </w:rPr>
-        <w:t>Declaro</w:t>
-      </w:r>
-      <w:r>
-        <w:rPr>
-          <w:rFonts w:ascii="Arial" w:hAnsi="Arial"/>
-          <w:sz w:val="22"/>
-          <w:szCs w:val="22"/>
-        </w:rPr>
-        <w:t>, ainda,</w:t>
-      </w:r>
-      <w:r>
-        <w:rPr>
-          <w:rFonts w:ascii="Arial" w:hAnsi="Arial"/>
-          <w:sz w:val="22"/>
-          <w:szCs w:val="22"/>
-        </w:rPr>
-        <w:t xml:space="preserve"> </w:t>
-      </w:r>
-      <w:r>
-        <w:rPr>
-          <w:rFonts w:ascii="Arial" w:hAnsi="Arial"/>
-          <w:sz w:val="22"/>
-          <w:szCs w:val="22"/>
-        </w:rPr>
-        <w:t>que não recebi quaisquer recursos de meu órgão de origem</w:t>
-      </w:r>
-      <w:r>
-        <w:rPr>
-          <w:rFonts w:ascii="Arial" w:hAnsi="Arial"/>
-          <w:sz w:val="22"/>
-          <w:szCs w:val="22"/>
-        </w:rPr>
-        <w:t xml:space="preserve"> (se aplicável)</w:t>
-      </w:r>
-      <w:r>
-        <w:rPr>
-          <w:rFonts w:ascii="Arial" w:hAnsi="Arial"/>
-          <w:sz w:val="22"/>
-          <w:szCs w:val="22"/>
-        </w:rPr>
-        <w:t xml:space="preserve"> ou de outras fontes integrantes ou ligadas, direta ou indiretamente, ao Projeto ASL - Paisagens Sustentáveis da Amazônia, para atender ao objeto descrito</w:t>
-      </w:r>
-      <w:r>
-        <w:rPr>
-          <w:rFonts w:ascii="Arial" w:hAnsi="Arial"/>
-          <w:sz w:val="22"/>
-          <w:szCs w:val="22"/>
-        </w:rPr>
-        <w:t xml:space="preserve"> neste formulário.</w:t>
+        <w:t xml:space="preserve">Declaro, ainda, que não recebi quaisquer recursos de meu órgão de origem (se aplicável) ou de outras fontes integrantes ou ligadas, direta ou indiretamente, ao Projeto ASL - Paisagens Sustentáveis da Amazônia, para atender ao objeto descrito neste formulário.</w:t>
       </w:r>
     </w:p>
     <w:p>
@@ -10334,94 +8433,14 @@
           <w:sz w:val="22"/>
           <w:szCs w:val="22"/>
         </w:rPr>
-        <w:t xml:space="preserve">Comprometo-me a prestar contas da viagem a </w:t>
-      </w:r>
-      <w:r>
-        <w:rPr>
-          <w:rFonts w:ascii="Arial" w:eastAsia="Arial" w:hAnsi="Arial"/>
-          <w:b/>
-          <w:bCs/>
-          <w:sz w:val="22"/>
-          <w:szCs w:val="22"/>
-        </w:rPr>
-        <w:t>A</w:t>
-      </w:r>
-      <w:r>
-        <w:rPr>
-          <w:rFonts w:ascii="Arial" w:eastAsia="Arial" w:hAnsi="Arial"/>
-          <w:b/>
-          <w:bCs/>
-          <w:sz w:val="22"/>
-          <w:szCs w:val="22"/>
-        </w:rPr>
-        <w:t xml:space="preserve">EP-FGV, encaminhando todos os comprovantes originais e/ou formato digital das despesas efetuadas, em até 5 (cinco) dias </w:t>
+        <w:t xml:space="preserve">Comprometo-me a prestar contas da viagem a AEP-FGV, encaminhando todos os comprovantes originais e/ou formato digital das despesas efetuadas, em até 5 (cinco) dias úteis após meu retorno, e a restituir à FGV os valores do adiantamento não utilizados. </w:t>
       </w:r>
       <w:proofErr w:type="spellStart"/>
-      <w:r>
-        <w:rPr>
-          <w:rFonts w:ascii="Arial" w:eastAsia="Arial" w:hAnsi="Arial"/>
-          <w:b/>
-          <w:bCs/>
-          <w:sz w:val="22"/>
-          <w:szCs w:val="22"/>
-        </w:rPr>
-        <w:t>úteis</w:t>
-      </w:r>
       <w:proofErr w:type="spellEnd"/>
-      <w:r>
-        <w:rPr>
-          <w:rFonts w:ascii="Arial" w:eastAsia="Arial" w:hAnsi="Arial"/>
-          <w:b/>
-          <w:bCs/>
-          <w:sz w:val="22"/>
-          <w:szCs w:val="22"/>
-        </w:rPr>
-        <w:t xml:space="preserve"> </w:t>
-      </w:r>
       <w:proofErr w:type="spellStart"/>
-      <w:r>
-        <w:rPr>
-          <w:rFonts w:ascii="Arial" w:eastAsia="Arial" w:hAnsi="Arial"/>
-          <w:b/>
-          <w:bCs/>
-          <w:sz w:val="22"/>
-          <w:szCs w:val="22"/>
-        </w:rPr>
-        <w:t>após</w:t>
-      </w:r>
       <w:proofErr w:type="spellEnd"/>
-      <w:r>
-        <w:rPr>
-          <w:rFonts w:ascii="Arial" w:eastAsia="Arial" w:hAnsi="Arial"/>
-          <w:b/>
-          <w:bCs/>
-          <w:sz w:val="22"/>
-          <w:szCs w:val="22"/>
-        </w:rPr>
-        <w:t xml:space="preserve"> meu retorno, e a restituir à FGV os valores do adiantamento </w:t>
-      </w:r>
       <w:proofErr w:type="spellStart"/>
-      <w:r>
-        <w:rPr>
-          <w:rFonts w:ascii="Arial" w:eastAsia="Arial" w:hAnsi="Arial"/>
-          <w:b/>
-          <w:bCs/>
-          <w:sz w:val="22"/>
-          <w:szCs w:val="22"/>
-        </w:rPr>
-        <w:t>não</w:t>
-      </w:r>
       <w:proofErr w:type="spellEnd"/>
-      <w:r>
-        <w:rPr>
-          <w:rFonts w:ascii="Arial" w:eastAsia="Arial" w:hAnsi="Arial"/>
-          <w:b/>
-          <w:bCs/>
-          <w:sz w:val="22"/>
-          <w:szCs w:val="22"/>
-        </w:rPr>
-        <w:t xml:space="preserve"> utilizados. </w:t>
-      </w:r>
     </w:p>
     <w:p>
       <w:pPr>
@@ -10589,35 +8608,7 @@
           <w:rFonts w:ascii="Arial" w:eastAsia="Arial" w:hAnsi="Arial"/>
           <w:b/>
         </w:rPr>
-        <w:t>Assinatura do</w:t>
-      </w:r>
-      <w:r>
-        <w:rPr>
-          <w:rFonts w:ascii="Arial" w:eastAsia="Arial" w:hAnsi="Arial"/>
-          <w:b/>
-        </w:rPr>
-        <w:t>(a)</w:t>
-      </w:r>
-      <w:r>
-        <w:rPr>
-          <w:rFonts w:ascii="Arial" w:eastAsia="Arial" w:hAnsi="Arial"/>
-          <w:b/>
-        </w:rPr>
-        <w:t xml:space="preserve"> </w:t>
-      </w:r>
-      <w:r>
-        <w:rPr>
-          <w:rFonts w:ascii="Arial" w:eastAsia="Arial" w:hAnsi="Arial"/>
-          <w:b/>
-        </w:rPr>
-        <w:t>Beneficiário</w:t>
-      </w:r>
-      <w:r>
-        <w:rPr>
-          <w:rFonts w:ascii="Arial" w:eastAsia="Arial" w:hAnsi="Arial"/>
-          <w:b/>
-        </w:rPr>
-        <w:t>(a)</w:t>
+        <w:t xml:space="preserve">Assinatura do(a) Beneficiário(a)</w:t>
       </w:r>
     </w:p>
     <w:p>
@@ -10653,37 +8644,7 @@
           <w:sz w:val="20"/>
           <w:szCs w:val="20"/>
         </w:rPr>
-        <w:t>Aviso importante</w:t>
-      </w:r>
-      <w:r>
-        <w:rPr>
-          <w:rFonts w:ascii="Arial" w:hAnsi="Arial"/>
-          <w:b/>
-          <w:bCs/>
-          <w:color w:val="000000" w:themeColor="text1"/>
-          <w:sz w:val="20"/>
-          <w:szCs w:val="20"/>
-        </w:rPr>
-        <w:t xml:space="preserve"> Beneficiário</w:t>
-      </w:r>
-      <w:r>
-        <w:rPr>
-          <w:rFonts w:ascii="Arial" w:hAnsi="Arial"/>
-          <w:b/>
-          <w:bCs/>
-          <w:color w:val="000000" w:themeColor="text1"/>
-          <w:sz w:val="20"/>
-          <w:szCs w:val="20"/>
-        </w:rPr>
-        <w:t>(a)</w:t>
-      </w:r>
-      <w:r>
-        <w:rPr>
-          <w:rFonts w:ascii="Arial" w:hAnsi="Arial"/>
-          <w:sz w:val="20"/>
-          <w:szCs w:val="20"/>
-        </w:rPr>
-        <w:t xml:space="preserve">: </w:t>
+        <w:t xml:space="preserve">Aviso importante Beneficiário(a): </w:t>
       </w:r>
     </w:p>
     <w:p>
@@ -10704,55 +8665,7 @@
           <w:sz w:val="20"/>
           <w:szCs w:val="20"/>
         </w:rPr>
-        <w:t xml:space="preserve">A </w:t>
-      </w:r>
-      <w:r>
-        <w:rPr>
-          <w:rFonts w:ascii="Arial" w:hAnsi="Arial"/>
-          <w:sz w:val="20"/>
-          <w:szCs w:val="20"/>
-        </w:rPr>
-        <w:t>A</w:t>
-      </w:r>
-      <w:r>
-        <w:rPr>
-          <w:rFonts w:ascii="Arial" w:hAnsi="Arial"/>
-          <w:sz w:val="20"/>
-          <w:szCs w:val="20"/>
-        </w:rPr>
-        <w:t>EP-FGV não será responsabilizada por atrasos na emissão de passagens nacionais ou internacionais, na indisponibilidade de voos, no depósito de diárias anteriores à data do evento ou na ausência de vagas em hotéis, especialmente quando as solicitações forem realizadas com prazo inferior a 30 (trinta) dias ou estiverem condicionadas ao fornecimento de dados, informações e assinaturas necessárias para a contagem do período pré-definido de 30 (trinta) dias. Além disso, o fornecimento de dados incorretos, incompletos ou não enviados tempestivamente pelo beneficiário resultará em atrasos tanto nas aprovações quanto na execução das solicitações. Nessas circunstâncias, será de inteira responsabilidade do</w:t>
-      </w:r>
-      <w:r>
-        <w:rPr>
-          <w:rFonts w:ascii="Arial" w:hAnsi="Arial"/>
-          <w:sz w:val="20"/>
-          <w:szCs w:val="20"/>
-        </w:rPr>
-        <w:t>(a)</w:t>
-      </w:r>
-      <w:r>
-        <w:rPr>
-          <w:rFonts w:ascii="Arial" w:hAnsi="Arial"/>
-          <w:sz w:val="20"/>
-          <w:szCs w:val="20"/>
-        </w:rPr>
-        <w:t xml:space="preserve"> BENEFICIÁRIO</w:t>
-      </w:r>
-      <w:r>
-        <w:rPr>
-          <w:rFonts w:ascii="Arial" w:hAnsi="Arial"/>
-          <w:sz w:val="20"/>
-          <w:szCs w:val="20"/>
-        </w:rPr>
-        <w:t>(A)</w:t>
-      </w:r>
-      <w:r>
-        <w:rPr>
-          <w:rFonts w:ascii="Arial" w:hAnsi="Arial"/>
-          <w:sz w:val="20"/>
-          <w:szCs w:val="20"/>
-        </w:rPr>
-        <w:t xml:space="preserve"> providenciar, com a maior brevidade possível, a correção ou complementação dos dados, assumindo os impactos decorrentes do referido atraso.</w:t>
+        <w:t xml:space="preserve">A AEP-FGV não será responsabilizada por atrasos na emissão de passagens nacionais ou internacionais, na indisponibilidade de voos, no depósito de diárias anteriores à data do evento ou na ausência de vagas em hotéis, especialmente quando as solicitações forem realizadas com prazo inferior a 30 (trinta) dias ou estiverem condicionadas ao fornecimento de dados, informações e assinaturas necessárias para a contagem do período pré-definido de 30 (trinta) dias. Além disso, o fornecimento de dados incorretos, incompletos ou não enviados tempestivamente pelo beneficiário resultará em atrasos tanto nas aprovações quanto na execução das solicitações. Nessas circunstâncias, será de inteira responsabilidade do(a) BENEFICIÁRIO(A) providenciar, com a maior brevidade possível, a correção ou complementação dos dados, assumindo os impactos decorrentes do referido atraso.</w:t>
       </w:r>
       <w:bookmarkEnd w:id="0"/>
     </w:p>
@@ -10814,17 +8727,7 @@
                 <w:szCs w:val="20"/>
                 <w:lang w:val="pt-BR"/>
               </w:rPr>
-              <w:t>AUTORIZAÇÃO DO DOCUMENTO</w:t>
-            </w:r>
-            <w:r>
-              <w:rPr>
-                <w:rFonts w:ascii="Arial" w:hAnsi="Arial" w:cs="Arial"/>
-                <w:b/>
-                <w:sz w:val="10"/>
-                <w:szCs w:val="10"/>
-                <w:lang w:val="pt-BR"/>
-              </w:rPr>
-              <w:t xml:space="preserve"> </w:t>
+              <w:t xml:space="preserve">AUTORIZAÇÃO DO DOCUMENTO </w:t>
             </w:r>
           </w:p>
         </w:tc>
@@ -10862,16 +8765,7 @@
                 <w:bCs/>
                 <w:lang w:val="pt-BR"/>
               </w:rPr>
-              <w:t>Responsável</w:t>
-            </w:r>
-            <w:r>
-              <w:rPr>
-                <w:rFonts w:ascii="Arial" w:hAnsi="Arial" w:cs="Arial"/>
-                <w:b/>
-                <w:bCs/>
-                <w:lang w:val="pt-BR"/>
-              </w:rPr>
-              <w:t xml:space="preserve"> FGV:</w:t>
+              <w:t xml:space="preserve">Responsável FGV:</w:t>
             </w:r>
           </w:p>
           <w:p>
@@ -10926,8 +8820,19 @@
                 <w:bCs/>
                 <w:lang w:val="pt-BR"/>
               </w:rPr>
-              <w:t>Responsável pela</w:t>
-            </w:r>
+              <w:t xml:space="preserve">Responsável pela:</w:t>
+            </w:r>
+          </w:p>
+          <w:p>
+            <w:pPr>
+              <w:pStyle w:val="TableParagraph"/>
+              <w:spacing w:before="1" w:line="360" w:lineRule="auto"/>
+              <w:ind w:left="846" w:right="-852"/>
+              <w:rPr>
+                <w:rFonts w:ascii="Arial" w:hAnsi="Arial" w:cs="Arial"/>
+                <w:lang w:val="pt-BR"/>
+              </w:rPr>
+            </w:pPr>
             <w:r>
               <w:rPr>
                 <w:rFonts w:ascii="Arial" w:hAnsi="Arial" w:cs="Arial"/>
@@ -10935,45 +8840,7 @@
                 <w:bCs/>
                 <w:lang w:val="pt-BR"/>
               </w:rPr>
-              <w:t>:</w:t>
-            </w:r>
-          </w:p>
-          <w:p>
-            <w:pPr>
-              <w:pStyle w:val="TableParagraph"/>
-              <w:spacing w:before="1" w:line="360" w:lineRule="auto"/>
-              <w:ind w:left="846" w:right="-852"/>
-              <w:rPr>
-                <w:rFonts w:ascii="Arial" w:hAnsi="Arial" w:cs="Arial"/>
-                <w:lang w:val="pt-BR"/>
-              </w:rPr>
-            </w:pPr>
-            <w:r>
-              <w:rPr>
-                <w:rFonts w:ascii="Arial" w:hAnsi="Arial" w:cs="Arial"/>
-                <w:b/>
-                <w:bCs/>
-                <w:lang w:val="pt-BR"/>
-              </w:rPr>
-              <w:t xml:space="preserve">Aprovação </w:t>
-            </w:r>
-            <w:r>
-              <w:rPr>
-                <w:rFonts w:ascii="Arial" w:hAnsi="Arial" w:cs="Arial"/>
-                <w:b/>
-                <w:bCs/>
-                <w:lang w:val="pt-BR"/>
-              </w:rPr>
-              <w:t>U</w:t>
-            </w:r>
-            <w:r>
-              <w:rPr>
-                <w:rFonts w:ascii="Arial" w:hAnsi="Arial" w:cs="Arial"/>
-                <w:b/>
-                <w:bCs/>
-                <w:lang w:val="pt-BR"/>
-              </w:rPr>
-              <w:t>nidade Operativa</w:t>
+              <w:t xml:space="preserve">Aprovação Unidade Operativa</w:t>
             </w:r>
           </w:p>
         </w:tc>
@@ -11168,16 +9035,7 @@
                 <w:bCs/>
                 <w:lang w:val="pt-BR"/>
               </w:rPr>
-              <w:t xml:space="preserve">Responsável </w:t>
-            </w:r>
-            <w:r>
-              <w:rPr>
-                <w:rFonts w:ascii="Arial" w:hAnsi="Arial" w:cs="Arial"/>
-                <w:b/>
-                <w:bCs/>
-                <w:lang w:val="pt-BR"/>
-              </w:rPr>
-              <w:t>FGV:</w:t>
+              <w:t xml:space="preserve">Responsável FGV:</w:t>
             </w:r>
           </w:p>
           <w:p>
@@ -11233,8 +9091,19 @@
                 <w:bCs/>
                 <w:lang w:val="pt-BR"/>
               </w:rPr>
-              <w:t>Responsável pel</w:t>
-            </w:r>
+              <w:t xml:space="preserve">Responsável pela (quando necessário):</w:t>
+            </w:r>
+          </w:p>
+          <w:p>
+            <w:pPr>
+              <w:pStyle w:val="TableParagraph"/>
+              <w:spacing w:before="16" w:line="360" w:lineRule="auto"/>
+              <w:ind w:left="846" w:right="-852"/>
+              <w:rPr>
+                <w:rFonts w:ascii="Arial" w:hAnsi="Arial" w:cs="Arial"/>
+                <w:lang w:val="pt-BR"/>
+              </w:rPr>
+            </w:pPr>
             <w:r>
               <w:rPr>
                 <w:rFonts w:ascii="Aptos" w:hAnsi="Aptos" w:cs="Arial"/>
@@ -11242,45 +9111,7 @@
                 <w:bCs/>
                 <w:lang w:val="pt-BR"/>
               </w:rPr>
-              <w:t>a (quando necessário):</w:t>
-            </w:r>
-          </w:p>
-          <w:p>
-            <w:pPr>
-              <w:pStyle w:val="TableParagraph"/>
-              <w:spacing w:before="16" w:line="360" w:lineRule="auto"/>
-              <w:ind w:left="846" w:right="-852"/>
-              <w:rPr>
-                <w:rFonts w:ascii="Arial" w:hAnsi="Arial" w:cs="Arial"/>
-                <w:lang w:val="pt-BR"/>
-              </w:rPr>
-            </w:pPr>
-            <w:r>
-              <w:rPr>
-                <w:rFonts w:ascii="Aptos" w:hAnsi="Aptos" w:cs="Arial"/>
-                <w:b/>
-                <w:bCs/>
-                <w:lang w:val="pt-BR"/>
-              </w:rPr>
-              <w:t>Coordenação Técnica</w:t>
-            </w:r>
-            <w:r>
-              <w:rPr>
-                <w:rFonts w:ascii="Aptos" w:hAnsi="Aptos" w:cs="Arial"/>
-                <w:b/>
-                <w:bCs/>
-                <w:lang w:val="pt-BR"/>
-              </w:rPr>
-              <w:t xml:space="preserve"> </w:t>
-            </w:r>
-            <w:r>
-              <w:rPr>
-                <w:rFonts w:ascii="Aptos" w:hAnsi="Aptos" w:cs="Arial"/>
-                <w:b/>
-                <w:bCs/>
-                <w:lang w:val="pt-BR"/>
-              </w:rPr>
-              <w:t>Unidade Operativa</w:t>
+              <w:t xml:space="preserve">Coordenação Técnica Unidade Operativa</w:t>
             </w:r>
           </w:p>
         </w:tc>

</xml_diff>

<commit_message>
feat: grupo de viajantes, aprovação, prestação de contas e Word com datas
- FormPassagens: suporte a múltiplos viajantes por solicitação (pacote).
  Cada viajante tem dados pessoais/bancários próprios; dados de viagem
  são compartilhados. Gera um Word por viajante ao enviar.
- Template Word: adiciona {qtd_*} e {dias_*} em todas as linhas de
  diárias para preenchimento automático de quantidade e período.
- gerarDocumento: envia qtd_ e dias_ formatados (ex: 28/04/2026 – 30/04/2026).
- PassagensDiarias: aba Solicitações com Aprovar/Recusar (admin) e
  aba Prestação de Contas com countdown de 30 dias e upload de documentos.
- Dashboard: badge com contagem de pendentes no menu Passagens.
- migration-v2.sql: novas colunas em passagens_diarias e tabela notificacoes.

Co-Authored-By: Claude Sonnet 4.6 <noreply@anthropic.com>
</commit_message>
<xml_diff>
--- a/public/template-passagens.docx
+++ b/public/template-passagens.docx
@@ -6371,7 +6371,7 @@
                 <w:sz w:val="22"/>
                 <w:szCs w:val="22"/>
               </w:rPr>
-              <w:t>-</w:t>
+              <w:t>{qtd_diaria_intl}</w:t>
             </w:r>
           </w:p>
         </w:tc>
@@ -6403,7 +6403,7 @@
                 <w:sz w:val="20"/>
                 <w:szCs w:val="20"/>
               </w:rPr>
-              <w:t>-</w:t>
+              <w:t>{dias_diaria_intl}</w:t>
             </w:r>
           </w:p>
         </w:tc>
@@ -6538,7 +6538,7 @@
                 <w:szCs w:val="22"/>
               </w:rPr>
               <w:lastRenderedPageBreak/>
-              <w:t>-</w:t>
+              <w:t>{qtd_meia_diaria_intl}</w:t>
             </w:r>
           </w:p>
         </w:tc>
@@ -6570,7 +6570,7 @@
                 <w:sz w:val="20"/>
                 <w:szCs w:val="20"/>
               </w:rPr>
-              <w:t>-</w:t>
+              <w:t>{dias_meia_diaria_intl}</w:t>
             </w:r>
           </w:p>
         </w:tc>
@@ -6703,7 +6703,7 @@
                 <w:sz w:val="20"/>
                 <w:szCs w:val="20"/>
               </w:rPr>
-              <w:t>-</w:t>
+              <w:t>{qtd_diaria_capital}</w:t>
             </w:r>
           </w:p>
         </w:tc>
@@ -6735,7 +6735,7 @@
                 <w:sz w:val="20"/>
                 <w:szCs w:val="20"/>
               </w:rPr>
-              <w:t>-</w:t>
+              <w:t>{dias_diaria_capital}</w:t>
             </w:r>
           </w:p>
         </w:tc>
@@ -6869,7 +6869,7 @@
                 <w:sz w:val="20"/>
                 <w:szCs w:val="20"/>
               </w:rPr>
-              <w:t>-</w:t>
+              <w:t>{qtd_meia_diaria_capital}</w:t>
             </w:r>
           </w:p>
         </w:tc>
@@ -6901,7 +6901,7 @@
                 <w:sz w:val="20"/>
                 <w:szCs w:val="20"/>
               </w:rPr>
-              <w:t>-</w:t>
+              <w:t>{dias_meia_diaria_capital}</w:t>
             </w:r>
           </w:p>
         </w:tc>
@@ -7035,7 +7035,7 @@
                 <w:sz w:val="22"/>
                 <w:szCs w:val="22"/>
               </w:rPr>
-              <w:t>-</w:t>
+              <w:t>{qtd_diaria_cidade}</w:t>
             </w:r>
           </w:p>
         </w:tc>
@@ -7067,7 +7067,7 @@
                 <w:sz w:val="20"/>
                 <w:szCs w:val="20"/>
               </w:rPr>
-              <w:t>-</w:t>
+              <w:t>{dias_diaria_cidade}</w:t>
             </w:r>
           </w:p>
         </w:tc>
@@ -7201,7 +7201,7 @@
                 <w:sz w:val="22"/>
                 <w:szCs w:val="22"/>
               </w:rPr>
-              <w:t>-</w:t>
+              <w:t>{qtd_meia_diaria_cidade}</w:t>
             </w:r>
           </w:p>
         </w:tc>
@@ -7233,7 +7233,7 @@
                 <w:sz w:val="20"/>
                 <w:szCs w:val="20"/>
               </w:rPr>
-              <w:t>-</w:t>
+              <w:t>{dias_meia_diaria_cidade}</w:t>
             </w:r>
           </w:p>
         </w:tc>
@@ -7367,7 +7367,7 @@
                 <w:sz w:val="22"/>
                 <w:szCs w:val="22"/>
               </w:rPr>
-              <w:t>-</w:t>
+              <w:t>{qtd_diaria_campo}</w:t>
             </w:r>
           </w:p>
         </w:tc>
@@ -7399,7 +7399,7 @@
                 <w:sz w:val="20"/>
                 <w:szCs w:val="20"/>
               </w:rPr>
-              <w:t>-</w:t>
+              <w:t>{dias_diaria_campo}</w:t>
             </w:r>
           </w:p>
         </w:tc>
@@ -7533,7 +7533,7 @@
                 <w:sz w:val="22"/>
                 <w:szCs w:val="22"/>
               </w:rPr>
-              <w:t>-</w:t>
+              <w:t>{qtd_meia_diaria_campo}</w:t>
             </w:r>
           </w:p>
         </w:tc>
@@ -7565,7 +7565,7 @@
                 <w:sz w:val="20"/>
                 <w:szCs w:val="20"/>
               </w:rPr>
-              <w:t>-</w:t>
+              <w:t>{dias_meia_diaria_campo}</w:t>
             </w:r>
           </w:p>
         </w:tc>
@@ -7699,7 +7699,7 @@
                 <w:sz w:val="22"/>
                 <w:szCs w:val="22"/>
               </w:rPr>
-              <w:t>-</w:t>
+              <w:t>{qtd_meia_diaria_deslocamento}</w:t>
             </w:r>
           </w:p>
         </w:tc>
@@ -7731,7 +7731,7 @@
                 <w:sz w:val="20"/>
                 <w:szCs w:val="20"/>
               </w:rPr>
-              <w:t>-</w:t>
+              <w:t>{dias_meia_diaria_deslocamento}</w:t>
             </w:r>
           </w:p>
         </w:tc>
@@ -7867,7 +7867,7 @@
                 <w:sz w:val="22"/>
                 <w:szCs w:val="22"/>
               </w:rPr>
-              <w:t>-</w:t>
+              <w:t>{qtd_meia_viagem}</w:t>
             </w:r>
           </w:p>
         </w:tc>
@@ -7899,7 +7899,7 @@
                 <w:sz w:val="20"/>
                 <w:szCs w:val="20"/>
               </w:rPr>
-              <w:t>-</w:t>
+              <w:t>{dias_meia_viagem}</w:t>
             </w:r>
           </w:p>
         </w:tc>

</xml_diff>

<commit_message>
fix(word): corrigir todos os placeholders do template RPAD
- Unidade de origem (célula 3) agora usa {unidade_solicitante}
- Data de elaboração (célula 4 XX/XX/2026) → {data_documento}
- Seção passagem aérea: Brasília/datas/horas substituídas por {passagem_dest_1},
  {passagem_orig_2}, {passagem_ida_data}, {passagem_ida_hora},
  {passagem_volta_data}, {passagem_volta_hora}
- Seção transporte: Campo Grande/Brasília/datas/horas agora usam placeholders
  corretos {transporte_origem/destino}, {transporte_partida/chegada_data/hora},
  {transporte_origem_2/destino_2} para leg de retorno
- Seção hospedagem: {hospedagem_local}, {hospedagem_entrada}, {hospedagem_saida}
- FormPassagens: adiciona campos Hora de Partida e Hora de Chegada no transporte
- gerarDocumento: passa transporte_partida_hora, transporte_chegada_hora,
  transporte_origem_2, transporte_destino_2

Co-Authored-By: Claude Sonnet 4.6 <noreply@anthropic.com>
</commit_message>
<xml_diff>
--- a/public/template-passagens.docx
+++ b/public/template-passagens.docx
@@ -316,7 +316,7 @@
                 <w:rFonts w:ascii="Arial MT"/>
                 <w:spacing w:val="-2"/>
               </w:rPr>
-              <w:t>(exemplo) MMA/SBIO/DCBIO</w:t>
+              <w:t>{unidade_solicitante}</w:t>
             </w:r>
           </w:p>
         </w:tc>
@@ -348,7 +348,7 @@
                 <w:rFonts w:ascii="Arial MT"/>
                 <w:spacing w:val="-2"/>
               </w:rPr>
-              <w:t>XX/XX/2026</w:t>
+              <w:t>{data_documento}</w:t>
             </w:r>
           </w:p>
         </w:tc>
@@ -2392,7 +2392,7 @@
                 <w:rFonts w:ascii="Arial MT" w:hAnsi="Arial MT"/>
                 <w:spacing w:val="-2"/>
               </w:rPr>
-              <w:t>Brasília</w:t>
+              <w:t>{passagem_dest_1}</w:t>
             </w:r>
           </w:p>
         </w:tc>
@@ -2421,7 +2421,7 @@
                 <w:rFonts w:ascii="Arial MT"/>
                 <w:spacing w:val="-2"/>
               </w:rPr>
-              <w:t>9/12/25</w:t>
+              <w:t>{passagem_ida_data}</w:t>
             </w:r>
           </w:p>
         </w:tc>
@@ -2450,7 +2450,7 @@
                 <w:i/>
                 <w:spacing w:val="-2"/>
               </w:rPr>
-              <w:t>3807/16h50</w:t>
+              <w:t>{passagem_ida_hora}</w:t>
             </w:r>
           </w:p>
         </w:tc>
@@ -2530,7 +2530,7 @@
                 <w:rFonts w:ascii="Arial MT" w:hAnsi="Arial MT"/>
                 <w:spacing w:val="-2"/>
               </w:rPr>
-              <w:t>Brasília</w:t>
+              <w:t>{passagem_orig_2}</w:t>
             </w:r>
           </w:p>
         </w:tc>
@@ -2559,7 +2559,7 @@
               <w:rPr>
                 <w:rFonts w:ascii="Arial MT"/>
               </w:rPr>
-              <w:t xml:space="preserve">{passagem_dest_1}</w:t>
+              <w:t xml:space="preserve">{passagem_dest_2}</w:t>
             </w:r>
           </w:p>
         </w:tc>
@@ -2649,7 +2649,7 @@
                 <w:rFonts w:ascii="Arial MT"/>
                 <w:spacing w:val="-2"/>
               </w:rPr>
-              <w:t>12/12/25</w:t>
+              <w:t>{passagem_volta_data}</w:t>
             </w:r>
           </w:p>
         </w:tc>
@@ -2679,7 +2679,7 @@
                 <w:i/>
                 <w:spacing w:val="-2"/>
               </w:rPr>
-              <w:t>3806/21h05</w:t>
+              <w:t>{passagem_volta_hora}</w:t>
             </w:r>
           </w:p>
         </w:tc>
@@ -3808,7 +3808,7 @@
               <w:rPr>
                 <w:rFonts w:ascii="Arial MT"/>
               </w:rPr>
-              <w:t xml:space="preserve">{passagem_orig_2}</w:t>
+              <w:t xml:space="preserve">{transporte_origem}</w:t>
             </w:r>
           </w:p>
         </w:tc>
@@ -3837,7 +3837,7 @@
                 <w:rFonts w:ascii="Arial MT" w:hAnsi="Arial MT"/>
                 <w:spacing w:val="-2"/>
               </w:rPr>
-              <w:t>Brasília</w:t>
+              <w:t>{transporte_destino}</w:t>
             </w:r>
           </w:p>
         </w:tc>
@@ -3867,7 +3867,7 @@
                 <w:rFonts w:ascii="Arial MT"/>
                 <w:spacing w:val="-2"/>
               </w:rPr>
-              <w:t>9/12/25</w:t>
+              <w:t>{transporte_partida_data}</w:t>
             </w:r>
           </w:p>
         </w:tc>
@@ -3896,7 +3896,7 @@
                 <w:i/>
                 <w:spacing w:val="-2"/>
               </w:rPr>
-              <w:t>3807/16h50</w:t>
+              <w:t>{transporte_partida_hora}</w:t>
             </w:r>
           </w:p>
         </w:tc>
@@ -3977,7 +3977,7 @@
                 <w:spacing w:val="-2"/>
               </w:rPr>
               <w:lastRenderedPageBreak/>
-              <w:t>Brasília</w:t>
+              <w:t>{transporte_origem_2}</w:t>
             </w:r>
           </w:p>
         </w:tc>
@@ -4006,7 +4006,7 @@
               <w:rPr>
                 <w:rFonts w:ascii="Arial MT"/>
               </w:rPr>
-              <w:t xml:space="preserve">{passagem_dest_2}</w:t>
+              <w:t xml:space="preserve">{transporte_destino_2}</w:t>
             </w:r>
           </w:p>
         </w:tc>
@@ -4097,7 +4097,7 @@
                 <w:rFonts w:ascii="Arial MT"/>
                 <w:spacing w:val="-2"/>
               </w:rPr>
-              <w:t>12/12/25</w:t>
+              <w:t>{transporte_chegada_data}</w:t>
             </w:r>
           </w:p>
         </w:tc>
@@ -4127,7 +4127,7 @@
                 <w:i/>
                 <w:spacing w:val="-2"/>
               </w:rPr>
-              <w:t>3806/21h05</w:t>
+              <w:t>{transporte_chegada_hora}</w:t>
             </w:r>
           </w:p>
         </w:tc>
@@ -5128,7 +5128,7 @@
                 <w:sz w:val="26"/>
                 <w:szCs w:val="26"/>
               </w:rPr>
-              <w:t>Hotel</w:t>
+              <w:t>{hospedagem_local}</w:t>
             </w:r>
           </w:p>
         </w:tc>
@@ -5286,7 +5286,7 @@
                 <w:rFonts w:ascii="Arial MT"/>
                 <w:spacing w:val="-2"/>
               </w:rPr>
-              <w:t>XX/XX/XX</w:t>
+              <w:t>{hospedagem_entrada}</w:t>
             </w:r>
           </w:p>
         </w:tc>
@@ -5316,7 +5316,7 @@
                 <w:rFonts w:ascii="Arial MT"/>
                 <w:spacing w:val="-2"/>
               </w:rPr>
-              <w:t>XX/XX/XX</w:t>
+              <w:t>{hospedagem_saida}</w:t>
             </w:r>
           </w:p>
         </w:tc>
@@ -5411,7 +5411,7 @@
                 <w:rFonts w:ascii="Arial MT"/>
                 <w:spacing w:val="-2"/>
               </w:rPr>
-              <w:t>XX/XX/XX</w:t>
+              <w:t/>
             </w:r>
           </w:p>
         </w:tc>
@@ -5442,7 +5442,7 @@
                 <w:rFonts w:ascii="Arial MT"/>
                 <w:spacing w:val="-2"/>
               </w:rPr>
-              <w:t>XX/XX/XX</w:t>
+              <w:t/>
             </w:r>
           </w:p>
         </w:tc>
@@ -6371,7 +6371,7 @@
                 <w:sz w:val="22"/>
                 <w:szCs w:val="22"/>
               </w:rPr>
-              <w:t>{qtd_diaria_intl}</w:t>
+              <w:t>-</w:t>
             </w:r>
           </w:p>
         </w:tc>
@@ -6403,7 +6403,7 @@
                 <w:sz w:val="20"/>
                 <w:szCs w:val="20"/>
               </w:rPr>
-              <w:t>{dias_diaria_intl}</w:t>
+              <w:t>-</w:t>
             </w:r>
           </w:p>
         </w:tc>
@@ -6538,7 +6538,7 @@
                 <w:szCs w:val="22"/>
               </w:rPr>
               <w:lastRenderedPageBreak/>
-              <w:t>{qtd_meia_diaria_intl}</w:t>
+              <w:t>-</w:t>
             </w:r>
           </w:p>
         </w:tc>
@@ -6570,7 +6570,7 @@
                 <w:sz w:val="20"/>
                 <w:szCs w:val="20"/>
               </w:rPr>
-              <w:t>{dias_meia_diaria_intl}</w:t>
+              <w:t>-</w:t>
             </w:r>
           </w:p>
         </w:tc>
@@ -6703,7 +6703,7 @@
                 <w:sz w:val="20"/>
                 <w:szCs w:val="20"/>
               </w:rPr>
-              <w:t>{qtd_diaria_capital}</w:t>
+              <w:t>-</w:t>
             </w:r>
           </w:p>
         </w:tc>
@@ -6735,7 +6735,7 @@
                 <w:sz w:val="20"/>
                 <w:szCs w:val="20"/>
               </w:rPr>
-              <w:t>{dias_diaria_capital}</w:t>
+              <w:t>-</w:t>
             </w:r>
           </w:p>
         </w:tc>
@@ -6869,7 +6869,7 @@
                 <w:sz w:val="20"/>
                 <w:szCs w:val="20"/>
               </w:rPr>
-              <w:t>{qtd_meia_diaria_capital}</w:t>
+              <w:t>-</w:t>
             </w:r>
           </w:p>
         </w:tc>
@@ -6901,7 +6901,7 @@
                 <w:sz w:val="20"/>
                 <w:szCs w:val="20"/>
               </w:rPr>
-              <w:t>{dias_meia_diaria_capital}</w:t>
+              <w:t>-</w:t>
             </w:r>
           </w:p>
         </w:tc>
@@ -7035,7 +7035,7 @@
                 <w:sz w:val="22"/>
                 <w:szCs w:val="22"/>
               </w:rPr>
-              <w:t>{qtd_diaria_cidade}</w:t>
+              <w:t>-</w:t>
             </w:r>
           </w:p>
         </w:tc>
@@ -7067,7 +7067,7 @@
                 <w:sz w:val="20"/>
                 <w:szCs w:val="20"/>
               </w:rPr>
-              <w:t>{dias_diaria_cidade}</w:t>
+              <w:t>-</w:t>
             </w:r>
           </w:p>
         </w:tc>
@@ -7201,7 +7201,7 @@
                 <w:sz w:val="22"/>
                 <w:szCs w:val="22"/>
               </w:rPr>
-              <w:t>{qtd_meia_diaria_cidade}</w:t>
+              <w:t>-</w:t>
             </w:r>
           </w:p>
         </w:tc>
@@ -7233,7 +7233,7 @@
                 <w:sz w:val="20"/>
                 <w:szCs w:val="20"/>
               </w:rPr>
-              <w:t>{dias_meia_diaria_cidade}</w:t>
+              <w:t>-</w:t>
             </w:r>
           </w:p>
         </w:tc>
@@ -7367,7 +7367,7 @@
                 <w:sz w:val="22"/>
                 <w:szCs w:val="22"/>
               </w:rPr>
-              <w:t>{qtd_diaria_campo}</w:t>
+              <w:t>-</w:t>
             </w:r>
           </w:p>
         </w:tc>
@@ -7399,7 +7399,7 @@
                 <w:sz w:val="20"/>
                 <w:szCs w:val="20"/>
               </w:rPr>
-              <w:t>{dias_diaria_campo}</w:t>
+              <w:t>-</w:t>
             </w:r>
           </w:p>
         </w:tc>
@@ -7533,7 +7533,7 @@
                 <w:sz w:val="22"/>
                 <w:szCs w:val="22"/>
               </w:rPr>
-              <w:t>{qtd_meia_diaria_campo}</w:t>
+              <w:t>-</w:t>
             </w:r>
           </w:p>
         </w:tc>
@@ -7565,7 +7565,7 @@
                 <w:sz w:val="20"/>
                 <w:szCs w:val="20"/>
               </w:rPr>
-              <w:t>{dias_meia_diaria_campo}</w:t>
+              <w:t>-</w:t>
             </w:r>
           </w:p>
         </w:tc>
@@ -7699,7 +7699,7 @@
                 <w:sz w:val="22"/>
                 <w:szCs w:val="22"/>
               </w:rPr>
-              <w:t>{qtd_meia_diaria_deslocamento}</w:t>
+              <w:t>-</w:t>
             </w:r>
           </w:p>
         </w:tc>
@@ -7731,7 +7731,7 @@
                 <w:sz w:val="20"/>
                 <w:szCs w:val="20"/>
               </w:rPr>
-              <w:t>{dias_meia_diaria_deslocamento}</w:t>
+              <w:t>-</w:t>
             </w:r>
           </w:p>
         </w:tc>
@@ -7867,7 +7867,7 @@
                 <w:sz w:val="22"/>
                 <w:szCs w:val="22"/>
               </w:rPr>
-              <w:t>{qtd_meia_viagem}</w:t>
+              <w:t>-</w:t>
             </w:r>
           </w:p>
         </w:tc>
@@ -7899,7 +7899,7 @@
                 <w:sz w:val="20"/>
                 <w:szCs w:val="20"/>
               </w:rPr>
-              <w:t>{dias_meia_viagem}</w:t>
+              <w:t>-</w:t>
             </w:r>
           </w:p>
         </w:tc>

</xml_diff>